<commit_message>
fix Place Order UC Specification & Activity Diagram
</commit_message>
<xml_diff>
--- a/RequirementAnalysis/SRS/[TEAM-16]SoftwareRequirementSpecification-[Ver1.2].docx
+++ b/RequirementAnalysis/SRS/[TEAM-16]SoftwareRequirementSpecification-[Ver1.2].docx
@@ -250,37 +250,37 @@
           <w:sz w:val="32"/>
           <w:szCs w:val="32"/>
         </w:rPr>
-        <w:t xml:space="preserve"> Huy Diễn – 20235910</w:t>
-      </w:r>
-    </w:p>
-    <w:p>
-      <w:pPr>
-        <w:pStyle w:val="BodyText"/>
-        <w:jc w:val="center"/>
+        <w:t xml:space="preserve"> Huy </w:t>
+      </w:r>
+      <w:proofErr w:type="spellStart"/>
+      <w:r>
         <w:rPr>
           <w:rFonts w:ascii="Arial" w:hAnsi="Arial" w:cs="Arial"/>
           <w:sz w:val="32"/>
           <w:szCs w:val="32"/>
         </w:rPr>
-      </w:pPr>
-      <w:proofErr w:type="spellStart"/>
+        <w:t>Diễn</w:t>
+      </w:r>
+      <w:proofErr w:type="spellEnd"/>
       <w:r>
         <w:rPr>
           <w:rFonts w:ascii="Arial" w:hAnsi="Arial" w:cs="Arial"/>
           <w:sz w:val="32"/>
           <w:szCs w:val="32"/>
         </w:rPr>
-        <w:t>Phạm</w:t>
-      </w:r>
-      <w:proofErr w:type="spellEnd"/>
-      <w:r>
+        <w:t xml:space="preserve"> – 20235910</w:t>
+      </w:r>
+    </w:p>
+    <w:p>
+      <w:pPr>
+        <w:pStyle w:val="BodyText"/>
+        <w:jc w:val="center"/>
         <w:rPr>
           <w:rFonts w:ascii="Arial" w:hAnsi="Arial" w:cs="Arial"/>
           <w:sz w:val="32"/>
           <w:szCs w:val="32"/>
         </w:rPr>
-        <w:t xml:space="preserve"> </w:t>
-      </w:r>
+      </w:pPr>
       <w:proofErr w:type="spellStart"/>
       <w:r>
         <w:rPr>
@@ -288,7 +288,7 @@
           <w:sz w:val="32"/>
           <w:szCs w:val="32"/>
         </w:rPr>
-        <w:t>Đức</w:t>
+        <w:t>Phạm</w:t>
       </w:r>
       <w:proofErr w:type="spellEnd"/>
       <w:r>
@@ -306,7 +306,7 @@
           <w:sz w:val="32"/>
           <w:szCs w:val="32"/>
         </w:rPr>
-        <w:t>Phước</w:t>
+        <w:t>Đức</w:t>
       </w:r>
       <w:proofErr w:type="spellEnd"/>
       <w:r>
@@ -315,37 +315,37 @@
           <w:sz w:val="32"/>
           <w:szCs w:val="32"/>
         </w:rPr>
-        <w:t xml:space="preserve"> – 20235988</w:t>
-      </w:r>
-    </w:p>
-    <w:p>
-      <w:pPr>
-        <w:pStyle w:val="BodyText"/>
-        <w:jc w:val="center"/>
+        <w:t xml:space="preserve"> </w:t>
+      </w:r>
+      <w:proofErr w:type="spellStart"/>
+      <w:r>
         <w:rPr>
           <w:rFonts w:ascii="Arial" w:hAnsi="Arial" w:cs="Arial"/>
           <w:sz w:val="32"/>
           <w:szCs w:val="32"/>
         </w:rPr>
-      </w:pPr>
-      <w:proofErr w:type="spellStart"/>
+        <w:t>Phước</w:t>
+      </w:r>
+      <w:proofErr w:type="spellEnd"/>
       <w:r>
         <w:rPr>
           <w:rFonts w:ascii="Arial" w:hAnsi="Arial" w:cs="Arial"/>
           <w:sz w:val="32"/>
           <w:szCs w:val="32"/>
         </w:rPr>
-        <w:t>Nguyễn</w:t>
-      </w:r>
-      <w:proofErr w:type="spellEnd"/>
-      <w:r>
+        <w:t xml:space="preserve"> – 20235988</w:t>
+      </w:r>
+    </w:p>
+    <w:p>
+      <w:pPr>
+        <w:pStyle w:val="BodyText"/>
+        <w:jc w:val="center"/>
         <w:rPr>
           <w:rFonts w:ascii="Arial" w:hAnsi="Arial" w:cs="Arial"/>
           <w:sz w:val="32"/>
           <w:szCs w:val="32"/>
         </w:rPr>
-        <w:t xml:space="preserve"> </w:t>
-      </w:r>
+      </w:pPr>
       <w:proofErr w:type="spellStart"/>
       <w:r>
         <w:rPr>
@@ -353,7 +353,7 @@
           <w:sz w:val="32"/>
           <w:szCs w:val="32"/>
         </w:rPr>
-        <w:t>Tiến</w:t>
+        <w:t>Nguyễn</w:t>
       </w:r>
       <w:proofErr w:type="spellEnd"/>
       <w:r>
@@ -371,7 +371,7 @@
           <w:sz w:val="32"/>
           <w:szCs w:val="32"/>
         </w:rPr>
-        <w:t>Đạt</w:t>
+        <w:t>Tiến</w:t>
       </w:r>
       <w:proofErr w:type="spellEnd"/>
       <w:r>
@@ -380,25 +380,43 @@
           <w:sz w:val="32"/>
           <w:szCs w:val="32"/>
         </w:rPr>
-        <w:t xml:space="preserve"> – 20239715</w:t>
-      </w:r>
-    </w:p>
-    <w:p>
-      <w:pPr>
-        <w:pStyle w:val="BodyText"/>
-        <w:jc w:val="center"/>
+        <w:t xml:space="preserve"> </w:t>
+      </w:r>
+      <w:proofErr w:type="spellStart"/>
+      <w:r>
         <w:rPr>
           <w:rFonts w:ascii="Arial" w:hAnsi="Arial" w:cs="Arial"/>
           <w:sz w:val="32"/>
           <w:szCs w:val="32"/>
         </w:rPr>
-      </w:pPr>
+        <w:t>Đạt</w:t>
+      </w:r>
+      <w:proofErr w:type="spellEnd"/>
       <w:r>
         <w:rPr>
           <w:rFonts w:ascii="Arial" w:hAnsi="Arial" w:cs="Arial"/>
           <w:sz w:val="32"/>
           <w:szCs w:val="32"/>
         </w:rPr>
+        <w:t xml:space="preserve"> – 20239715</w:t>
+      </w:r>
+    </w:p>
+    <w:p>
+      <w:pPr>
+        <w:pStyle w:val="BodyText"/>
+        <w:jc w:val="center"/>
+        <w:rPr>
+          <w:rFonts w:ascii="Arial" w:hAnsi="Arial" w:cs="Arial"/>
+          <w:sz w:val="32"/>
+          <w:szCs w:val="32"/>
+        </w:rPr>
+      </w:pPr>
+      <w:r>
+        <w:rPr>
+          <w:rFonts w:ascii="Arial" w:hAnsi="Arial" w:cs="Arial"/>
+          <w:sz w:val="32"/>
+          <w:szCs w:val="32"/>
+        </w:rPr>
         <w:t>Lê Hoàng Kiên – 20235958</w:t>
       </w:r>
     </w:p>
@@ -458,23 +476,13 @@
         <w:t xml:space="preserve"> </w:t>
       </w:r>
       <w:bookmarkStart w:id="2" w:name="_Toc61315196"/>
-      <w:proofErr w:type="gramStart"/>
       <w:r>
         <w:rPr>
           <w:rFonts w:ascii="Arial" w:hAnsi="Arial" w:cs="Arial"/>
           <w:i/>
           <w:sz w:val="28"/>
         </w:rPr>
-        <w:t>March,</w:t>
-      </w:r>
-      <w:proofErr w:type="gramEnd"/>
-      <w:r>
-        <w:rPr>
-          <w:rFonts w:ascii="Arial" w:hAnsi="Arial" w:cs="Arial"/>
-          <w:i/>
-          <w:sz w:val="28"/>
-        </w:rPr>
-        <w:t xml:space="preserve"> 2026</w:t>
+        <w:t>March, 2026</w:t>
       </w:r>
     </w:p>
     <w:p>
@@ -511,6 +519,7 @@
       <w:bookmarkStart w:id="3" w:name="_Toc224597104"/>
       <w:bookmarkEnd w:id="2"/>
       <w:r>
+        <w:lastRenderedPageBreak/>
         <w:t>Table of contents</w:t>
       </w:r>
       <w:bookmarkEnd w:id="3"/>
@@ -2326,6 +2335,7 @@
       <w:bookmarkEnd w:id="1"/>
       <w:bookmarkEnd w:id="4"/>
       <w:r>
+        <w:lastRenderedPageBreak/>
         <w:t>Introduction</w:t>
       </w:r>
       <w:bookmarkEnd w:id="5"/>
@@ -3070,25 +3080,7 @@
                 <w:color w:val="303030"/>
                 <w:sz w:val="20"/>
               </w:rPr>
-              <w:t xml:space="preserve">Stands for "An Internet Media Store", </w:t>
-            </w:r>
-            <w:proofErr w:type="gramStart"/>
-            <w:r>
-              <w:rPr>
-                <w:rFonts w:eastAsia="Times New Roman"/>
-                <w:color w:val="303030"/>
-                <w:sz w:val="20"/>
-              </w:rPr>
-              <w:t>an e</w:t>
-            </w:r>
-            <w:proofErr w:type="gramEnd"/>
-            <w:r>
-              <w:rPr>
-                <w:rFonts w:eastAsia="Times New Roman"/>
-                <w:color w:val="303030"/>
-                <w:sz w:val="20"/>
-              </w:rPr>
-              <w:t>-commerce software that supports the buying and selling of physical media products</w:t>
+              <w:t>Stands for "An Internet Media Store", an e-commerce software that supports the buying and selling of physical media products</w:t>
             </w:r>
           </w:p>
         </w:tc>
@@ -3405,23 +3397,7 @@
                 <w:color w:val="303030"/>
                 <w:sz w:val="20"/>
               </w:rPr>
-              <w:t xml:space="preserve">Value Added Tax. The system strictly applies </w:t>
-            </w:r>
-            <w:proofErr w:type="gramStart"/>
-            <w:r>
-              <w:rPr>
-                <w:color w:val="303030"/>
-                <w:sz w:val="20"/>
-              </w:rPr>
-              <w:t>a 10</w:t>
-            </w:r>
-            <w:proofErr w:type="gramEnd"/>
-            <w:r>
-              <w:rPr>
-                <w:color w:val="303030"/>
-                <w:sz w:val="20"/>
-              </w:rPr>
-              <w:t>% VAT for all physical media items</w:t>
+              <w:t>Value Added Tax. The system strictly applies a 10% VAT for all physical media items</w:t>
             </w:r>
           </w:p>
         </w:tc>
@@ -4665,23 +4641,7 @@
                       <w:color w:val="303030"/>
                       <w:sz w:val="20"/>
                     </w:rPr>
-                    <w:t xml:space="preserve"> APIs. The token </w:t>
-                  </w:r>
-                  <w:proofErr w:type="gramStart"/>
-                  <w:r>
-                    <w:rPr>
-                      <w:color w:val="303030"/>
-                      <w:sz w:val="20"/>
-                    </w:rPr>
-                    <w:t>perform</w:t>
-                  </w:r>
-                  <w:proofErr w:type="gramEnd"/>
-                  <w:r>
-                    <w:rPr>
-                      <w:color w:val="303030"/>
-                      <w:sz w:val="20"/>
-                    </w:rPr>
-                    <w:t xml:space="preserve"> payment-related requests.</w:t>
+                    <w:t xml:space="preserve"> APIs. The token perform payment-related requests.</w:t>
                   </w:r>
                 </w:p>
               </w:tc>
@@ -4803,22 +4763,10 @@
           <w:b/>
           <w:bCs/>
         </w:rPr>
-        <w:t>Software Requirements Specification (SRS</w:t>
-      </w:r>
-      <w:proofErr w:type="gramStart"/>
-      <w:r>
-        <w:rPr>
-          <w:b/>
-          <w:bCs/>
-        </w:rPr>
-        <w:t>)</w:t>
-      </w:r>
-      <w:r>
-        <w:t>,Software</w:t>
-      </w:r>
-      <w:proofErr w:type="gramEnd"/>
-      <w:r>
-        <w:t xml:space="preserve"> Engineering Course Materials, Hanoi University of Science and Technology.</w:t>
+        <w:t>Software Requirements Specification (SRS)</w:t>
+      </w:r>
+      <w:r>
+        <w:t>,Software Engineering Course Materials, Hanoi University of Science and Technology.</w:t>
       </w:r>
     </w:p>
     <w:p>
@@ -4986,6 +4934,7 @@
       </w:pPr>
       <w:bookmarkStart w:id="10" w:name="_Toc224597110"/>
       <w:r>
+        <w:lastRenderedPageBreak/>
         <w:t>Overall D</w:t>
       </w:r>
       <w:r>
@@ -5184,6 +5133,7 @@
         <w:rPr>
           <w:lang w:val="vi-VN"/>
         </w:rPr>
+        <w:lastRenderedPageBreak/>
         <w:t>Overall requirements</w:t>
       </w:r>
       <w:bookmarkEnd w:id="12"/>
@@ -5316,6 +5266,7 @@
         </w:numPr>
       </w:pPr>
       <w:r>
+        <w:lastRenderedPageBreak/>
         <w:t xml:space="preserve">Purchase Process: which describes </w:t>
       </w:r>
       <w:r>
@@ -5386,6 +5337,7 @@
         <w:rPr>
           <w:noProof/>
         </w:rPr>
+        <w:lastRenderedPageBreak/>
         <w:drawing>
           <wp:inline distT="0" distB="0" distL="0" distR="0" wp14:anchorId="215772D2" wp14:editId="0DBB2A0D">
             <wp:extent cx="5486400" cy="6701790"/>
@@ -5472,6 +5424,7 @@
         <w:rPr>
           <w:noProof/>
         </w:rPr>
+        <w:lastRenderedPageBreak/>
         <w:drawing>
           <wp:inline distT="0" distB="0" distL="0" distR="0" wp14:anchorId="07AE437E" wp14:editId="66502346">
             <wp:extent cx="5486400" cy="4361815"/>
@@ -5564,6 +5517,7 @@
         <w:rPr>
           <w:noProof/>
         </w:rPr>
+        <w:lastRenderedPageBreak/>
         <w:drawing>
           <wp:inline distT="0" distB="0" distL="0" distR="0" wp14:anchorId="68F61521" wp14:editId="042302C4">
             <wp:extent cx="5486400" cy="4015740"/>
@@ -5642,6 +5596,7 @@
       </w:pPr>
       <w:bookmarkStart w:id="14" w:name="_Toc224597114"/>
       <w:r>
+        <w:lastRenderedPageBreak/>
         <w:t xml:space="preserve">Detailed </w:t>
       </w:r>
       <w:r>
@@ -5786,11 +5741,6 @@
             </w:r>
           </w:p>
           <w:p>
-            <w:r>
-              <w:t>The use case can only be invoked if the following condition is satisfied:</w:t>
-            </w:r>
-          </w:p>
-          <w:p>
             <w:pPr>
               <w:pStyle w:val="ListParagraph"/>
               <w:numPr>
@@ -5835,7 +5785,16 @@
           </w:p>
           <w:p>
             <w:r>
-              <w:t>Step 3. AIMS Software displays the delivery form and prompts the customer to set up delivery information</w:t>
+              <w:t>Step 3. AIMS Software displays the delivery form</w:t>
+            </w:r>
+            <w:r>
+              <w:rPr>
+                <w:lang w:val="en-US"/>
+              </w:rPr>
+              <w:t xml:space="preserve"> (see Table 2)</w:t>
+            </w:r>
+            <w:r>
+              <w:t xml:space="preserve"> and prompts the customer to set up delivery information</w:t>
             </w:r>
           </w:p>
           <w:p>
@@ -5854,8 +5813,19 @@
             </w:r>
           </w:p>
           <w:p>
+            <w:pPr>
+              <w:rPr>
+                <w:lang w:val="en-US"/>
+              </w:rPr>
+            </w:pPr>
             <w:r>
               <w:t>Step 7. AIMS Software displays and temporarily saves invoice information</w:t>
+            </w:r>
+            <w:r>
+              <w:rPr>
+                <w:lang w:val="en-US"/>
+              </w:rPr>
+              <w:t xml:space="preserve"> (see Table 3)</w:t>
             </w:r>
           </w:p>
           <w:p>
@@ -5875,7 +5845,25 @@
           </w:p>
           <w:p>
             <w:r>
-              <w:t>Step 11. AIMS Software displays general order information and transaction information to screen</w:t>
+              <w:t>Step 11. AIMS Software displays general order information</w:t>
+            </w:r>
+            <w:r>
+              <w:rPr>
+                <w:lang w:val="en-US"/>
+              </w:rPr>
+              <w:t xml:space="preserve"> (see Table 4)</w:t>
+            </w:r>
+            <w:r>
+              <w:t xml:space="preserve"> and transaction information</w:t>
+            </w:r>
+            <w:r>
+              <w:rPr>
+                <w:lang w:val="en-US"/>
+              </w:rPr>
+              <w:t xml:space="preserve"> (see Table 5)</w:t>
+            </w:r>
+            <w:r>
+              <w:t xml:space="preserve"> to screen</w:t>
             </w:r>
           </w:p>
           <w:p>
@@ -5885,6 +5873,7 @@
           </w:p>
           <w:p>
             <w:r>
+              <w:lastRenderedPageBreak/>
               <w:t>Step 13. AIMS Software records payment transaction information and successfully paid order</w:t>
             </w:r>
           </w:p>
@@ -5924,7 +5913,7 @@
             <w:tr>
               <w:tc>
                 <w:tcPr>
-                  <w:tcW w:w="563" w:type="dxa"/>
+                  <w:tcW w:w="552" w:type="dxa"/>
                   <w:vAlign w:val="center"/>
                 </w:tcPr>
                 <w:p>
@@ -5946,7 +5935,7 @@
               </w:tc>
               <w:tc>
                 <w:tcPr>
-                  <w:tcW w:w="1300" w:type="dxa"/>
+                  <w:tcW w:w="1259" w:type="dxa"/>
                   <w:vAlign w:val="center"/>
                 </w:tcPr>
                 <w:p>
@@ -5968,7 +5957,7 @@
               </w:tc>
               <w:tc>
                 <w:tcPr>
-                  <w:tcW w:w="2527" w:type="dxa"/>
+                  <w:tcW w:w="2232" w:type="dxa"/>
                   <w:vAlign w:val="center"/>
                 </w:tcPr>
                 <w:p>
@@ -5990,7 +5979,7 @@
               </w:tc>
               <w:tc>
                 <w:tcPr>
-                  <w:tcW w:w="3660" w:type="dxa"/>
+                  <w:tcW w:w="3102" w:type="dxa"/>
                   <w:vAlign w:val="center"/>
                 </w:tcPr>
                 <w:p>
@@ -6012,7 +6001,7 @@
               </w:tc>
               <w:tc>
                 <w:tcPr>
-                  <w:tcW w:w="1300" w:type="dxa"/>
+                  <w:tcW w:w="1259" w:type="dxa"/>
                   <w:vAlign w:val="center"/>
                 </w:tcPr>
                 <w:p>
@@ -6036,7 +6025,7 @@
             <w:tr>
               <w:tc>
                 <w:tcPr>
-                  <w:tcW w:w="563" w:type="dxa"/>
+                  <w:tcW w:w="552" w:type="dxa"/>
                   <w:vAlign w:val="center"/>
                 </w:tcPr>
                 <w:p>
@@ -6058,7 +6047,7 @@
               </w:tc>
               <w:tc>
                 <w:tcPr>
-                  <w:tcW w:w="1300" w:type="dxa"/>
+                  <w:tcW w:w="1259" w:type="dxa"/>
                   <w:vAlign w:val="center"/>
                 </w:tcPr>
                 <w:p>
@@ -6080,7 +6069,7 @@
               </w:tc>
               <w:tc>
                 <w:tcPr>
-                  <w:tcW w:w="2527" w:type="dxa"/>
+                  <w:tcW w:w="2232" w:type="dxa"/>
                   <w:vAlign w:val="center"/>
                 </w:tcPr>
                 <w:p>
@@ -6102,7 +6091,7 @@
               </w:tc>
               <w:tc>
                 <w:tcPr>
-                  <w:tcW w:w="3660" w:type="dxa"/>
+                  <w:tcW w:w="3102" w:type="dxa"/>
                   <w:vAlign w:val="center"/>
                 </w:tcPr>
                 <w:p>
@@ -6124,7 +6113,7 @@
               </w:tc>
               <w:tc>
                 <w:tcPr>
-                  <w:tcW w:w="1300" w:type="dxa"/>
+                  <w:tcW w:w="1259" w:type="dxa"/>
                   <w:vAlign w:val="center"/>
                 </w:tcPr>
                 <w:p>
@@ -6148,7 +6137,7 @@
             <w:tr>
               <w:tc>
                 <w:tcPr>
-                  <w:tcW w:w="563" w:type="dxa"/>
+                  <w:tcW w:w="552" w:type="dxa"/>
                   <w:vAlign w:val="center"/>
                 </w:tcPr>
                 <w:p>
@@ -6170,7 +6159,7 @@
               </w:tc>
               <w:tc>
                 <w:tcPr>
-                  <w:tcW w:w="1300" w:type="dxa"/>
+                  <w:tcW w:w="1259" w:type="dxa"/>
                   <w:vAlign w:val="center"/>
                 </w:tcPr>
                 <w:p>
@@ -6192,7 +6181,7 @@
               </w:tc>
               <w:tc>
                 <w:tcPr>
-                  <w:tcW w:w="2527" w:type="dxa"/>
+                  <w:tcW w:w="2232" w:type="dxa"/>
                   <w:vAlign w:val="center"/>
                 </w:tcPr>
                 <w:p>
@@ -6214,7 +6203,7 @@
               </w:tc>
               <w:tc>
                 <w:tcPr>
-                  <w:tcW w:w="3660" w:type="dxa"/>
+                  <w:tcW w:w="3102" w:type="dxa"/>
                   <w:vAlign w:val="center"/>
                 </w:tcPr>
                 <w:p>
@@ -6236,7 +6225,7 @@
               </w:tc>
               <w:tc>
                 <w:tcPr>
-                  <w:tcW w:w="1300" w:type="dxa"/>
+                  <w:tcW w:w="1259" w:type="dxa"/>
                   <w:vAlign w:val="center"/>
                 </w:tcPr>
                 <w:p>
@@ -6260,7 +6249,7 @@
             <w:tr>
               <w:tc>
                 <w:tcPr>
-                  <w:tcW w:w="563" w:type="dxa"/>
+                  <w:tcW w:w="552" w:type="dxa"/>
                   <w:vAlign w:val="center"/>
                 </w:tcPr>
                 <w:p>
@@ -6282,7 +6271,7 @@
               </w:tc>
               <w:tc>
                 <w:tcPr>
-                  <w:tcW w:w="1300" w:type="dxa"/>
+                  <w:tcW w:w="1259" w:type="dxa"/>
                   <w:vAlign w:val="center"/>
                 </w:tcPr>
                 <w:p>
@@ -6304,7 +6293,7 @@
               </w:tc>
               <w:tc>
                 <w:tcPr>
-                  <w:tcW w:w="2527" w:type="dxa"/>
+                  <w:tcW w:w="2232" w:type="dxa"/>
                   <w:vAlign w:val="center"/>
                 </w:tcPr>
                 <w:p>
@@ -6333,7 +6322,7 @@
               </w:tc>
               <w:tc>
                 <w:tcPr>
-                  <w:tcW w:w="3660" w:type="dxa"/>
+                  <w:tcW w:w="3102" w:type="dxa"/>
                   <w:vAlign w:val="center"/>
                 </w:tcPr>
                 <w:p>
@@ -6355,7 +6344,7 @@
               </w:tc>
               <w:tc>
                 <w:tcPr>
-                  <w:tcW w:w="1300" w:type="dxa"/>
+                  <w:tcW w:w="1259" w:type="dxa"/>
                   <w:vAlign w:val="center"/>
                 </w:tcPr>
                 <w:p>
@@ -6379,7 +6368,7 @@
             <w:tr>
               <w:tc>
                 <w:tcPr>
-                  <w:tcW w:w="563" w:type="dxa"/>
+                  <w:tcW w:w="552" w:type="dxa"/>
                   <w:vAlign w:val="center"/>
                 </w:tcPr>
                 <w:p>
@@ -6401,7 +6390,7 @@
               </w:tc>
               <w:tc>
                 <w:tcPr>
-                  <w:tcW w:w="1300" w:type="dxa"/>
+                  <w:tcW w:w="1259" w:type="dxa"/>
                   <w:vAlign w:val="center"/>
                 </w:tcPr>
                 <w:p>
@@ -6423,7 +6412,7 @@
               </w:tc>
               <w:tc>
                 <w:tcPr>
-                  <w:tcW w:w="2527" w:type="dxa"/>
+                  <w:tcW w:w="2232" w:type="dxa"/>
                   <w:vAlign w:val="center"/>
                 </w:tcPr>
                 <w:p>
@@ -6445,7 +6434,7 @@
               </w:tc>
               <w:tc>
                 <w:tcPr>
-                  <w:tcW w:w="3660" w:type="dxa"/>
+                  <w:tcW w:w="3102" w:type="dxa"/>
                   <w:vAlign w:val="center"/>
                 </w:tcPr>
                 <w:p>
@@ -6474,7 +6463,7 @@
               </w:tc>
               <w:tc>
                 <w:tcPr>
-                  <w:tcW w:w="1300" w:type="dxa"/>
+                  <w:tcW w:w="1259" w:type="dxa"/>
                   <w:vAlign w:val="center"/>
                 </w:tcPr>
                 <w:p>
@@ -6498,7 +6487,7 @@
             <w:tr>
               <w:tc>
                 <w:tcPr>
-                  <w:tcW w:w="563" w:type="dxa"/>
+                  <w:tcW w:w="552" w:type="dxa"/>
                   <w:vAlign w:val="center"/>
                 </w:tcPr>
                 <w:p>
@@ -6520,7 +6509,7 @@
               </w:tc>
               <w:tc>
                 <w:tcPr>
-                  <w:tcW w:w="1300" w:type="dxa"/>
+                  <w:tcW w:w="1259" w:type="dxa"/>
                   <w:vAlign w:val="center"/>
                 </w:tcPr>
                 <w:p>
@@ -6542,7 +6531,7 @@
               </w:tc>
               <w:tc>
                 <w:tcPr>
-                  <w:tcW w:w="2527" w:type="dxa"/>
+                  <w:tcW w:w="2232" w:type="dxa"/>
                   <w:vAlign w:val="center"/>
                 </w:tcPr>
                 <w:p>
@@ -6558,13 +6547,13 @@
                       <w:sz w:val="22"/>
                       <w:szCs w:val="22"/>
                     </w:rPr>
-                    <w:t>Customer requests to go back to step N</w:t>
-                  </w:r>
-                </w:p>
-              </w:tc>
-              <w:tc>
-                <w:tcPr>
-                  <w:tcW w:w="3660" w:type="dxa"/>
+                    <w:t>Customer requests to go back to a step numbered N</w:t>
+                  </w:r>
+                </w:p>
+              </w:tc>
+              <w:tc>
+                <w:tcPr>
+                  <w:tcW w:w="3102" w:type="dxa"/>
                   <w:vAlign w:val="center"/>
                 </w:tcPr>
                 <w:p>
@@ -6580,13 +6569,13 @@
                       <w:sz w:val="22"/>
                       <w:szCs w:val="22"/>
                     </w:rPr>
-                    <w:t>AIMS Software redirects to step N</w:t>
-                  </w:r>
-                </w:p>
-              </w:tc>
-              <w:tc>
-                <w:tcPr>
-                  <w:tcW w:w="1300" w:type="dxa"/>
+                    <w:t>AIMS Software redirects to that step</w:t>
+                  </w:r>
+                </w:p>
+              </w:tc>
+              <w:tc>
+                <w:tcPr>
+                  <w:tcW w:w="1259" w:type="dxa"/>
                   <w:vAlign w:val="center"/>
                 </w:tcPr>
                 <w:p>
@@ -6602,7 +6591,22 @@
                       <w:sz w:val="22"/>
                       <w:szCs w:val="22"/>
                     </w:rPr>
-                    <w:t>Step N</w:t>
+                    <w:t>Step</w:t>
+                  </w:r>
+                  <w:r>
+                    <w:rPr>
+                      <w:sz w:val="22"/>
+                      <w:szCs w:val="22"/>
+                      <w:lang w:val="en-US"/>
+                    </w:rPr>
+                    <w:t xml:space="preserve"> number</w:t>
+                  </w:r>
+                  <w:r>
+                    <w:rPr>
+                      <w:sz w:val="22"/>
+                      <w:szCs w:val="22"/>
+                    </w:rPr>
+                    <w:t xml:space="preserve"> N</w:t>
                   </w:r>
                 </w:p>
               </w:tc>
@@ -6610,7 +6614,7 @@
             <w:tr>
               <w:tc>
                 <w:tcPr>
-                  <w:tcW w:w="563" w:type="dxa"/>
+                  <w:tcW w:w="552" w:type="dxa"/>
                   <w:vAlign w:val="center"/>
                 </w:tcPr>
                 <w:p>
@@ -6632,7 +6636,7 @@
               </w:tc>
               <w:tc>
                 <w:tcPr>
-                  <w:tcW w:w="1300" w:type="dxa"/>
+                  <w:tcW w:w="1259" w:type="dxa"/>
                   <w:vAlign w:val="center"/>
                 </w:tcPr>
                 <w:p>
@@ -6654,7 +6658,7 @@
               </w:tc>
               <w:tc>
                 <w:tcPr>
-                  <w:tcW w:w="2527" w:type="dxa"/>
+                  <w:tcW w:w="2232" w:type="dxa"/>
                   <w:vAlign w:val="center"/>
                 </w:tcPr>
                 <w:p>
@@ -6676,7 +6680,7 @@
               </w:tc>
               <w:tc>
                 <w:tcPr>
-                  <w:tcW w:w="3660" w:type="dxa"/>
+                  <w:tcW w:w="3102" w:type="dxa"/>
                   <w:vAlign w:val="center"/>
                 </w:tcPr>
                 <w:p>
@@ -6698,7 +6702,7 @@
               </w:tc>
               <w:tc>
                 <w:tcPr>
-                  <w:tcW w:w="1300" w:type="dxa"/>
+                  <w:tcW w:w="1259" w:type="dxa"/>
                   <w:vAlign w:val="center"/>
                 </w:tcPr>
                 <w:p>
@@ -6722,7 +6726,7 @@
             <w:tr>
               <w:tc>
                 <w:tcPr>
-                  <w:tcW w:w="563" w:type="dxa"/>
+                  <w:tcW w:w="552" w:type="dxa"/>
                   <w:vAlign w:val="center"/>
                 </w:tcPr>
                 <w:p>
@@ -6744,7 +6748,7 @@
               </w:tc>
               <w:tc>
                 <w:tcPr>
-                  <w:tcW w:w="1300" w:type="dxa"/>
+                  <w:tcW w:w="1259" w:type="dxa"/>
                   <w:vAlign w:val="center"/>
                 </w:tcPr>
                 <w:p>
@@ -6766,7 +6770,7 @@
               </w:tc>
               <w:tc>
                 <w:tcPr>
-                  <w:tcW w:w="2527" w:type="dxa"/>
+                  <w:tcW w:w="2232" w:type="dxa"/>
                   <w:vAlign w:val="center"/>
                 </w:tcPr>
                 <w:p>
@@ -6788,7 +6792,7 @@
               </w:tc>
               <w:tc>
                 <w:tcPr>
-                  <w:tcW w:w="3660" w:type="dxa"/>
+                  <w:tcW w:w="3102" w:type="dxa"/>
                   <w:vAlign w:val="center"/>
                 </w:tcPr>
                 <w:p>
@@ -6810,7 +6814,7 @@
               </w:tc>
               <w:tc>
                 <w:tcPr>
-                  <w:tcW w:w="1300" w:type="dxa"/>
+                  <w:tcW w:w="1259" w:type="dxa"/>
                   <w:vAlign w:val="center"/>
                 </w:tcPr>
                 <w:p>
@@ -6870,17 +6874,17 @@
               <w:tblLook w:val="04A0" w:firstRow="1" w:lastRow="0" w:firstColumn="1" w:lastColumn="0" w:noHBand="0" w:noVBand="1"/>
             </w:tblPr>
             <w:tblGrid>
-              <w:gridCol w:w="523"/>
-              <w:gridCol w:w="1712"/>
+              <w:gridCol w:w="517"/>
+              <w:gridCol w:w="1696"/>
               <w:gridCol w:w="1792"/>
-              <w:gridCol w:w="1411"/>
-              <w:gridCol w:w="1442"/>
-              <w:gridCol w:w="1524"/>
+              <w:gridCol w:w="1392"/>
+              <w:gridCol w:w="1335"/>
+              <w:gridCol w:w="1672"/>
             </w:tblGrid>
             <w:tr>
               <w:tc>
                 <w:tcPr>
-                  <w:tcW w:w="533" w:type="dxa"/>
+                  <w:tcW w:w="523" w:type="dxa"/>
                   <w:vAlign w:val="center"/>
                 </w:tcPr>
                 <w:p>
@@ -6902,7 +6906,7 @@
               </w:tc>
               <w:tc>
                 <w:tcPr>
-                  <w:tcW w:w="1737" w:type="dxa"/>
+                  <w:tcW w:w="1712" w:type="dxa"/>
                   <w:vAlign w:val="center"/>
                 </w:tcPr>
                 <w:p>
@@ -6924,7 +6928,7 @@
               </w:tc>
               <w:tc>
                 <w:tcPr>
-                  <w:tcW w:w="1517" w:type="dxa"/>
+                  <w:tcW w:w="1792" w:type="dxa"/>
                   <w:vAlign w:val="center"/>
                 </w:tcPr>
                 <w:p>
@@ -6946,6 +6950,28 @@
               </w:tc>
               <w:tc>
                 <w:tcPr>
+                  <w:tcW w:w="1411" w:type="dxa"/>
+                  <w:vAlign w:val="center"/>
+                </w:tcPr>
+                <w:p>
+                  <w:pPr>
+                    <w:jc w:val="center"/>
+                    <w:rPr>
+                      <w:b/>
+                      <w:bCs/>
+                    </w:rPr>
+                  </w:pPr>
+                  <w:r>
+                    <w:rPr>
+                      <w:b/>
+                      <w:bCs/>
+                    </w:rPr>
+                    <w:t>Mandatory</w:t>
+                  </w:r>
+                </w:p>
+              </w:tc>
+              <w:tc>
+                <w:tcPr>
                   <w:tcW w:w="1442" w:type="dxa"/>
                   <w:vAlign w:val="center"/>
                 </w:tcPr>
@@ -6962,13 +6988,13 @@
                       <w:b/>
                       <w:bCs/>
                     </w:rPr>
-                    <w:t>Mandatory</w:t>
-                  </w:r>
-                </w:p>
-              </w:tc>
-              <w:tc>
-                <w:tcPr>
-                  <w:tcW w:w="1614" w:type="dxa"/>
+                    <w:t>Valid Condition</w:t>
+                  </w:r>
+                </w:p>
+              </w:tc>
+              <w:tc>
+                <w:tcPr>
+                  <w:tcW w:w="1524" w:type="dxa"/>
                   <w:vAlign w:val="center"/>
                 </w:tcPr>
                 <w:p>
@@ -6984,28 +7010,6 @@
                       <w:b/>
                       <w:bCs/>
                     </w:rPr>
-                    <w:t>Valid Condition</w:t>
-                  </w:r>
-                </w:p>
-              </w:tc>
-              <w:tc>
-                <w:tcPr>
-                  <w:tcW w:w="1561" w:type="dxa"/>
-                  <w:vAlign w:val="center"/>
-                </w:tcPr>
-                <w:p>
-                  <w:pPr>
-                    <w:jc w:val="center"/>
-                    <w:rPr>
-                      <w:b/>
-                      <w:bCs/>
-                    </w:rPr>
-                  </w:pPr>
-                  <w:r>
-                    <w:rPr>
-                      <w:b/>
-                      <w:bCs/>
-                    </w:rPr>
                     <w:t>Example</w:t>
                   </w:r>
                 </w:p>
@@ -7014,7 +7018,7 @@
             <w:tr>
               <w:tc>
                 <w:tcPr>
-                  <w:tcW w:w="533" w:type="dxa"/>
+                  <w:tcW w:w="523" w:type="dxa"/>
                   <w:vAlign w:val="center"/>
                 </w:tcPr>
                 <w:p>
@@ -7036,7 +7040,7 @@
               </w:tc>
               <w:tc>
                 <w:tcPr>
-                  <w:tcW w:w="1737" w:type="dxa"/>
+                  <w:tcW w:w="1712" w:type="dxa"/>
                   <w:vAlign w:val="center"/>
                 </w:tcPr>
                 <w:p>
@@ -7058,7 +7062,7 @@
               </w:tc>
               <w:tc>
                 <w:tcPr>
-                  <w:tcW w:w="1517" w:type="dxa"/>
+                  <w:tcW w:w="1792" w:type="dxa"/>
                   <w:vAlign w:val="center"/>
                 </w:tcPr>
                 <w:p>
@@ -7075,6 +7079,28 @@
                       <w:szCs w:val="22"/>
                     </w:rPr>
                     <w:t>Name of the customer/receiver</w:t>
+                  </w:r>
+                </w:p>
+              </w:tc>
+              <w:tc>
+                <w:tcPr>
+                  <w:tcW w:w="1411" w:type="dxa"/>
+                  <w:vAlign w:val="center"/>
+                </w:tcPr>
+                <w:p>
+                  <w:pPr>
+                    <w:jc w:val="center"/>
+                    <w:rPr>
+                      <w:sz w:val="22"/>
+                      <w:szCs w:val="22"/>
+                    </w:rPr>
+                  </w:pPr>
+                  <w:r>
+                    <w:rPr>
+                      <w:sz w:val="22"/>
+                      <w:szCs w:val="22"/>
+                    </w:rPr>
+                    <w:t>Yes</w:t>
                   </w:r>
                 </w:p>
               </w:tc>
@@ -7085,28 +7111,6 @@
                 </w:tcPr>
                 <w:p>
                   <w:pPr>
-                    <w:jc w:val="center"/>
-                    <w:rPr>
-                      <w:sz w:val="22"/>
-                      <w:szCs w:val="22"/>
-                    </w:rPr>
-                  </w:pPr>
-                  <w:r>
-                    <w:rPr>
-                      <w:sz w:val="22"/>
-                      <w:szCs w:val="22"/>
-                    </w:rPr>
-                    <w:t>Yes</w:t>
-                  </w:r>
-                </w:p>
-              </w:tc>
-              <w:tc>
-                <w:tcPr>
-                  <w:tcW w:w="1614" w:type="dxa"/>
-                  <w:vAlign w:val="center"/>
-                </w:tcPr>
-                <w:p>
-                  <w:pPr>
                     <w:jc w:val="left"/>
                     <w:rPr>
                       <w:sz w:val="22"/>
@@ -7117,7 +7121,7 @@
               </w:tc>
               <w:tc>
                 <w:tcPr>
-                  <w:tcW w:w="1561" w:type="dxa"/>
+                  <w:tcW w:w="1524" w:type="dxa"/>
                   <w:vAlign w:val="center"/>
                 </w:tcPr>
                 <w:p>
@@ -7141,7 +7145,7 @@
             <w:tr>
               <w:tc>
                 <w:tcPr>
-                  <w:tcW w:w="533" w:type="dxa"/>
+                  <w:tcW w:w="523" w:type="dxa"/>
                   <w:vAlign w:val="center"/>
                 </w:tcPr>
                 <w:p>
@@ -7163,7 +7167,7 @@
               </w:tc>
               <w:tc>
                 <w:tcPr>
-                  <w:tcW w:w="1737" w:type="dxa"/>
+                  <w:tcW w:w="1712" w:type="dxa"/>
                   <w:vAlign w:val="center"/>
                 </w:tcPr>
                 <w:p>
@@ -7185,7 +7189,7 @@
               </w:tc>
               <w:tc>
                 <w:tcPr>
-                  <w:tcW w:w="1517" w:type="dxa"/>
+                  <w:tcW w:w="1792" w:type="dxa"/>
                   <w:vAlign w:val="center"/>
                 </w:tcPr>
                 <w:p>
@@ -7201,7 +7205,38 @@
                       <w:sz w:val="22"/>
                       <w:szCs w:val="22"/>
                     </w:rPr>
-                    <w:t>Contact number of the customer that will be used to contact the customer</w:t>
+                    <w:t xml:space="preserve">Contact number of the customer that will be used </w:t>
+                  </w:r>
+                  <w:r>
+                    <w:rPr>
+                      <w:sz w:val="22"/>
+                      <w:szCs w:val="22"/>
+                    </w:rPr>
+                    <w:lastRenderedPageBreak/>
+                    <w:t>to contact the customer</w:t>
+                  </w:r>
+                </w:p>
+              </w:tc>
+              <w:tc>
+                <w:tcPr>
+                  <w:tcW w:w="1411" w:type="dxa"/>
+                  <w:vAlign w:val="center"/>
+                </w:tcPr>
+                <w:p>
+                  <w:pPr>
+                    <w:jc w:val="center"/>
+                    <w:rPr>
+                      <w:sz w:val="22"/>
+                      <w:szCs w:val="22"/>
+                    </w:rPr>
+                  </w:pPr>
+                  <w:r>
+                    <w:rPr>
+                      <w:sz w:val="22"/>
+                      <w:szCs w:val="22"/>
+                    </w:rPr>
+                    <w:lastRenderedPageBreak/>
+                    <w:t>Yes</w:t>
                   </w:r>
                 </w:p>
               </w:tc>
@@ -7212,6 +7247,61 @@
                 </w:tcPr>
                 <w:p>
                   <w:pPr>
+                    <w:jc w:val="left"/>
+                    <w:rPr>
+                      <w:sz w:val="22"/>
+                      <w:szCs w:val="22"/>
+                    </w:rPr>
+                  </w:pPr>
+                  <w:r>
+                    <w:rPr>
+                      <w:sz w:val="22"/>
+                      <w:szCs w:val="22"/>
+                    </w:rPr>
+                    <w:t>- 10 digits</w:t>
+                  </w:r>
+                </w:p>
+                <w:p>
+                  <w:pPr>
+                    <w:jc w:val="left"/>
+                    <w:rPr>
+                      <w:sz w:val="22"/>
+                      <w:szCs w:val="22"/>
+                    </w:rPr>
+                  </w:pPr>
+                  <w:r>
+                    <w:rPr>
+                      <w:sz w:val="22"/>
+                      <w:szCs w:val="22"/>
+                    </w:rPr>
+                    <w:t>- Starts with 0</w:t>
+                  </w:r>
+                </w:p>
+                <w:p>
+                  <w:pPr>
+                    <w:jc w:val="left"/>
+                    <w:rPr>
+                      <w:sz w:val="22"/>
+                      <w:szCs w:val="22"/>
+                    </w:rPr>
+                  </w:pPr>
+                  <w:r>
+                    <w:rPr>
+                      <w:sz w:val="22"/>
+                      <w:szCs w:val="22"/>
+                    </w:rPr>
+                    <w:lastRenderedPageBreak/>
+                    <w:t>- May contain separators such as ‘-‘, ‘.’, or space in between digits</w:t>
+                  </w:r>
+                </w:p>
+              </w:tc>
+              <w:tc>
+                <w:tcPr>
+                  <w:tcW w:w="1524" w:type="dxa"/>
+                  <w:vAlign w:val="center"/>
+                </w:tcPr>
+                <w:p>
+                  <w:pPr>
                     <w:jc w:val="center"/>
                     <w:rPr>
                       <w:sz w:val="22"/>
@@ -7223,69 +7313,10 @@
                       <w:sz w:val="22"/>
                       <w:szCs w:val="22"/>
                     </w:rPr>
-                    <w:t>Yes</w:t>
-                  </w:r>
-                </w:p>
-              </w:tc>
-              <w:tc>
-                <w:tcPr>
-                  <w:tcW w:w="1614" w:type="dxa"/>
-                  <w:vAlign w:val="center"/>
-                </w:tcPr>
-                <w:p>
-                  <w:pPr>
-                    <w:jc w:val="left"/>
-                    <w:rPr>
-                      <w:sz w:val="22"/>
-                      <w:szCs w:val="22"/>
-                    </w:rPr>
-                  </w:pPr>
-                  <w:r>
-                    <w:rPr>
-                      <w:sz w:val="22"/>
-                      <w:szCs w:val="22"/>
-                    </w:rPr>
-                    <w:t>- 10 digits</w:t>
-                  </w:r>
-                </w:p>
-                <w:p>
-                  <w:pPr>
-                    <w:jc w:val="left"/>
-                    <w:rPr>
-                      <w:sz w:val="22"/>
-                      <w:szCs w:val="22"/>
-                    </w:rPr>
-                  </w:pPr>
-                  <w:r>
-                    <w:rPr>
-                      <w:sz w:val="22"/>
-                      <w:szCs w:val="22"/>
-                    </w:rPr>
-                    <w:t>- Starts with 0</w:t>
-                  </w:r>
-                </w:p>
-                <w:p>
-                  <w:pPr>
-                    <w:jc w:val="left"/>
-                    <w:rPr>
-                      <w:sz w:val="22"/>
-                      <w:szCs w:val="22"/>
-                    </w:rPr>
-                  </w:pPr>
-                  <w:r>
-                    <w:rPr>
-                      <w:sz w:val="22"/>
-                      <w:szCs w:val="22"/>
-                    </w:rPr>
-                    <w:t>- May contain separators such as ‘-‘, ‘.’, or space in between digits</w:t>
-                  </w:r>
-                </w:p>
-              </w:tc>
-              <w:tc>
-                <w:tcPr>
-                  <w:tcW w:w="1561" w:type="dxa"/>
-                  <w:vAlign w:val="center"/>
-                </w:tcPr>
+                    <w:lastRenderedPageBreak/>
+                    <w:t>0123456789</w:t>
+                  </w:r>
+                </w:p>
                 <w:p>
                   <w:pPr>
                     <w:jc w:val="center"/>
@@ -7299,7 +7330,7 @@
                       <w:sz w:val="22"/>
                       <w:szCs w:val="22"/>
                     </w:rPr>
-                    <w:t>0123456789</w:t>
+                    <w:t>0123.456.789</w:t>
                   </w:r>
                 </w:p>
                 <w:p>
@@ -7315,22 +7346,7 @@
                       <w:sz w:val="22"/>
                       <w:szCs w:val="22"/>
                     </w:rPr>
-                    <w:t>0123.456.789</w:t>
-                  </w:r>
-                </w:p>
-                <w:p>
-                  <w:pPr>
-                    <w:jc w:val="center"/>
-                    <w:rPr>
-                      <w:sz w:val="22"/>
-                      <w:szCs w:val="22"/>
-                    </w:rPr>
-                  </w:pPr>
-                  <w:r>
-                    <w:rPr>
-                      <w:sz w:val="22"/>
-                      <w:szCs w:val="22"/>
-                    </w:rPr>
+                    <w:lastRenderedPageBreak/>
                     <w:t>0123-456-789</w:t>
                   </w:r>
                 </w:p>
@@ -7387,7 +7403,7 @@
             <w:tr>
               <w:tc>
                 <w:tcPr>
-                  <w:tcW w:w="533" w:type="dxa"/>
+                  <w:tcW w:w="523" w:type="dxa"/>
                   <w:vAlign w:val="center"/>
                 </w:tcPr>
                 <w:p>
@@ -7396,20 +7412,22 @@
                     <w:rPr>
                       <w:sz w:val="22"/>
                       <w:szCs w:val="22"/>
-                    </w:rPr>
-                  </w:pPr>
-                  <w:r>
-                    <w:rPr>
-                      <w:sz w:val="22"/>
-                      <w:szCs w:val="22"/>
-                    </w:rPr>
+                      <w:lang w:val="en-US"/>
+                    </w:rPr>
+                  </w:pPr>
+                  <w:r>
+                    <w:rPr>
+                      <w:sz w:val="22"/>
+                      <w:szCs w:val="22"/>
+                    </w:rPr>
+                    <w:lastRenderedPageBreak/>
                     <w:t>3</w:t>
                   </w:r>
                 </w:p>
               </w:tc>
               <w:tc>
                 <w:tcPr>
-                  <w:tcW w:w="1737" w:type="dxa"/>
+                  <w:tcW w:w="1712" w:type="dxa"/>
                   <w:vAlign w:val="center"/>
                 </w:tcPr>
                 <w:p>
@@ -7425,9 +7443,15 @@
                       <w:sz w:val="22"/>
                       <w:szCs w:val="22"/>
                     </w:rPr>
-                    <w:t>Province/City</w:t>
-                  </w:r>
-                </w:p>
+                    <w:t>Email</w:t>
+                  </w:r>
+                </w:p>
+              </w:tc>
+              <w:tc>
+                <w:tcPr>
+                  <w:tcW w:w="1792" w:type="dxa"/>
+                  <w:vAlign w:val="center"/>
+                </w:tcPr>
                 <w:p>
                   <w:pPr>
                     <w:jc w:val="left"/>
@@ -7441,29 +7465,29 @@
                       <w:sz w:val="22"/>
                       <w:szCs w:val="22"/>
                     </w:rPr>
-                    <w:t>(Tỉnh/Thành phố)</w:t>
-                  </w:r>
-                </w:p>
-              </w:tc>
-              <w:tc>
-                <w:tcPr>
-                  <w:tcW w:w="1517" w:type="dxa"/>
+                    <w:t>Contact email of the customer that will be used to send order notifications</w:t>
+                  </w:r>
+                </w:p>
+              </w:tc>
+              <w:tc>
+                <w:tcPr>
+                  <w:tcW w:w="1411" w:type="dxa"/>
                   <w:vAlign w:val="center"/>
                 </w:tcPr>
                 <w:p>
                   <w:pPr>
-                    <w:jc w:val="left"/>
-                    <w:rPr>
-                      <w:sz w:val="22"/>
-                      <w:szCs w:val="22"/>
-                    </w:rPr>
-                  </w:pPr>
-                  <w:r>
-                    <w:rPr>
-                      <w:sz w:val="22"/>
-                      <w:szCs w:val="22"/>
-                    </w:rPr>
-                    <w:t>A province/city in Viet Nam, selectable from a list</w:t>
+                    <w:jc w:val="center"/>
+                    <w:rPr>
+                      <w:sz w:val="22"/>
+                      <w:szCs w:val="22"/>
+                    </w:rPr>
+                  </w:pPr>
+                  <w:r>
+                    <w:rPr>
+                      <w:sz w:val="22"/>
+                      <w:szCs w:val="22"/>
+                    </w:rPr>
+                    <w:t>Yes</w:t>
                   </w:r>
                 </w:p>
               </w:tc>
@@ -7474,6 +7498,28 @@
                 </w:tcPr>
                 <w:p>
                   <w:pPr>
+                    <w:jc w:val="left"/>
+                    <w:rPr>
+                      <w:sz w:val="22"/>
+                      <w:szCs w:val="22"/>
+                    </w:rPr>
+                  </w:pPr>
+                  <w:r>
+                    <w:rPr>
+                      <w:sz w:val="22"/>
+                      <w:szCs w:val="22"/>
+                    </w:rPr>
+                    <w:t>- Must be of valid form with an “@” symbol in between</w:t>
+                  </w:r>
+                </w:p>
+              </w:tc>
+              <w:tc>
+                <w:tcPr>
+                  <w:tcW w:w="1524" w:type="dxa"/>
+                  <w:vAlign w:val="center"/>
+                </w:tcPr>
+                <w:p>
+                  <w:pPr>
                     <w:jc w:val="center"/>
                     <w:rPr>
                       <w:sz w:val="22"/>
@@ -7485,76 +7531,7 @@
                       <w:sz w:val="22"/>
                       <w:szCs w:val="22"/>
                     </w:rPr>
-                    <w:t>Yes</w:t>
-                  </w:r>
-                </w:p>
-              </w:tc>
-              <w:tc>
-                <w:tcPr>
-                  <w:tcW w:w="1614" w:type="dxa"/>
-                  <w:vAlign w:val="center"/>
-                </w:tcPr>
-                <w:p>
-                  <w:pPr>
-                    <w:jc w:val="left"/>
-                    <w:rPr>
-                      <w:sz w:val="22"/>
-                      <w:szCs w:val="22"/>
-                    </w:rPr>
-                  </w:pPr>
-                </w:p>
-              </w:tc>
-              <w:tc>
-                <w:tcPr>
-                  <w:tcW w:w="1561" w:type="dxa"/>
-                  <w:vAlign w:val="center"/>
-                </w:tcPr>
-                <w:p>
-                  <w:pPr>
-                    <w:jc w:val="center"/>
-                    <w:rPr>
-                      <w:sz w:val="22"/>
-                      <w:szCs w:val="22"/>
-                    </w:rPr>
-                  </w:pPr>
-                  <w:r>
-                    <w:rPr>
-                      <w:sz w:val="22"/>
-                      <w:szCs w:val="22"/>
-                    </w:rPr>
-                    <w:t>Hà Nội</w:t>
-                  </w:r>
-                </w:p>
-                <w:p>
-                  <w:pPr>
-                    <w:jc w:val="center"/>
-                    <w:rPr>
-                      <w:sz w:val="22"/>
-                      <w:szCs w:val="22"/>
-                    </w:rPr>
-                  </w:pPr>
-                  <w:r>
-                    <w:rPr>
-                      <w:sz w:val="22"/>
-                      <w:szCs w:val="22"/>
-                    </w:rPr>
-                    <w:t>Nghệ An</w:t>
-                  </w:r>
-                </w:p>
-                <w:p>
-                  <w:pPr>
-                    <w:jc w:val="center"/>
-                    <w:rPr>
-                      <w:sz w:val="22"/>
-                      <w:szCs w:val="22"/>
-                    </w:rPr>
-                  </w:pPr>
-                  <w:r>
-                    <w:rPr>
-                      <w:sz w:val="22"/>
-                      <w:szCs w:val="22"/>
-                    </w:rPr>
-                    <w:t>…</w:t>
+                    <w:t>john26@ex.com</w:t>
                   </w:r>
                 </w:p>
               </w:tc>
@@ -7562,7 +7539,7 @@
             <w:tr>
               <w:tc>
                 <w:tcPr>
-                  <w:tcW w:w="533" w:type="dxa"/>
+                  <w:tcW w:w="523" w:type="dxa"/>
                   <w:vAlign w:val="center"/>
                 </w:tcPr>
                 <w:p>
@@ -7571,12 +7548,14 @@
                     <w:rPr>
                       <w:sz w:val="22"/>
                       <w:szCs w:val="22"/>
-                    </w:rPr>
-                  </w:pPr>
-                  <w:r>
-                    <w:rPr>
-                      <w:sz w:val="22"/>
-                      <w:szCs w:val="22"/>
+                      <w:lang w:val="en-US"/>
+                    </w:rPr>
+                  </w:pPr>
+                  <w:r>
+                    <w:rPr>
+                      <w:sz w:val="22"/>
+                      <w:szCs w:val="22"/>
+                      <w:lang w:val="en-US"/>
                     </w:rPr>
                     <w:t>4</w:t>
                   </w:r>
@@ -7584,7 +7563,7 @@
               </w:tc>
               <w:tc>
                 <w:tcPr>
-                  <w:tcW w:w="1737" w:type="dxa"/>
+                  <w:tcW w:w="1712" w:type="dxa"/>
                   <w:vAlign w:val="center"/>
                 </w:tcPr>
                 <w:p>
@@ -7600,7 +7579,7 @@
                       <w:sz w:val="22"/>
                       <w:szCs w:val="22"/>
                     </w:rPr>
-                    <w:t>Ward/Commune</w:t>
+                    <w:t>Province/City</w:t>
                   </w:r>
                 </w:p>
                 <w:p>
@@ -7616,13 +7595,13 @@
                       <w:sz w:val="22"/>
                       <w:szCs w:val="22"/>
                     </w:rPr>
-                    <w:t>(Phường/Xã)</w:t>
-                  </w:r>
-                </w:p>
-              </w:tc>
-              <w:tc>
-                <w:tcPr>
-                  <w:tcW w:w="1517" w:type="dxa"/>
+                    <w:t>(Tỉnh/Thành phố)</w:t>
+                  </w:r>
+                </w:p>
+              </w:tc>
+              <w:tc>
+                <w:tcPr>
+                  <w:tcW w:w="1792" w:type="dxa"/>
                   <w:vAlign w:val="center"/>
                 </w:tcPr>
                 <w:p>
@@ -7638,7 +7617,29 @@
                       <w:sz w:val="22"/>
                       <w:szCs w:val="22"/>
                     </w:rPr>
-                    <w:t>A ward/commune in that province/city, selectable from a list</w:t>
+                    <w:t>A province/city in Viet Nam, selectable from a list</w:t>
+                  </w:r>
+                </w:p>
+              </w:tc>
+              <w:tc>
+                <w:tcPr>
+                  <w:tcW w:w="1411" w:type="dxa"/>
+                  <w:vAlign w:val="center"/>
+                </w:tcPr>
+                <w:p>
+                  <w:pPr>
+                    <w:jc w:val="center"/>
+                    <w:rPr>
+                      <w:sz w:val="22"/>
+                      <w:szCs w:val="22"/>
+                    </w:rPr>
+                  </w:pPr>
+                  <w:r>
+                    <w:rPr>
+                      <w:sz w:val="22"/>
+                      <w:szCs w:val="22"/>
+                    </w:rPr>
+                    <w:t>Yes</w:t>
                   </w:r>
                 </w:p>
               </w:tc>
@@ -7649,6 +7650,21 @@
                 </w:tcPr>
                 <w:p>
                   <w:pPr>
+                    <w:jc w:val="left"/>
+                    <w:rPr>
+                      <w:sz w:val="22"/>
+                      <w:szCs w:val="22"/>
+                    </w:rPr>
+                  </w:pPr>
+                </w:p>
+              </w:tc>
+              <w:tc>
+                <w:tcPr>
+                  <w:tcW w:w="1524" w:type="dxa"/>
+                  <w:vAlign w:val="center"/>
+                </w:tcPr>
+                <w:p>
+                  <w:pPr>
                     <w:jc w:val="center"/>
                     <w:rPr>
                       <w:sz w:val="22"/>
@@ -7660,30 +7676,9 @@
                       <w:sz w:val="22"/>
                       <w:szCs w:val="22"/>
                     </w:rPr>
-                    <w:t>Yes</w:t>
-                  </w:r>
-                </w:p>
-              </w:tc>
-              <w:tc>
-                <w:tcPr>
-                  <w:tcW w:w="1614" w:type="dxa"/>
-                  <w:vAlign w:val="center"/>
-                </w:tcPr>
-                <w:p>
-                  <w:pPr>
-                    <w:jc w:val="left"/>
-                    <w:rPr>
-                      <w:sz w:val="22"/>
-                      <w:szCs w:val="22"/>
-                    </w:rPr>
-                  </w:pPr>
-                </w:p>
-              </w:tc>
-              <w:tc>
-                <w:tcPr>
-                  <w:tcW w:w="1561" w:type="dxa"/>
-                  <w:vAlign w:val="center"/>
-                </w:tcPr>
+                    <w:t>Hà Nội</w:t>
+                  </w:r>
+                </w:p>
                 <w:p>
                   <w:pPr>
                     <w:jc w:val="center"/>
@@ -7697,23 +7692,7 @@
                       <w:sz w:val="22"/>
                       <w:szCs w:val="22"/>
                     </w:rPr>
-                    <w:t>Phường Hà Đông</w:t>
-                  </w:r>
-                </w:p>
-                <w:p>
-                  <w:pPr>
-                    <w:jc w:val="center"/>
-                    <w:rPr>
-                      <w:sz w:val="22"/>
-                      <w:szCs w:val="22"/>
-                    </w:rPr>
-                  </w:pPr>
-                  <w:r>
-                    <w:rPr>
-                      <w:sz w:val="22"/>
-                      <w:szCs w:val="22"/>
-                    </w:rPr>
-                    <w:t>Xã An Khánh</w:t>
+                    <w:t>Nghệ An</w:t>
                   </w:r>
                 </w:p>
                 <w:p>
@@ -7737,7 +7716,7 @@
             <w:tr>
               <w:tc>
                 <w:tcPr>
-                  <w:tcW w:w="533" w:type="dxa"/>
+                  <w:tcW w:w="523" w:type="dxa"/>
                   <w:vAlign w:val="center"/>
                 </w:tcPr>
                 <w:p>
@@ -7746,12 +7725,14 @@
                     <w:rPr>
                       <w:sz w:val="22"/>
                       <w:szCs w:val="22"/>
-                    </w:rPr>
-                  </w:pPr>
-                  <w:r>
-                    <w:rPr>
-                      <w:sz w:val="22"/>
-                      <w:szCs w:val="22"/>
+                      <w:lang w:val="en-US"/>
+                    </w:rPr>
+                  </w:pPr>
+                  <w:r>
+                    <w:rPr>
+                      <w:sz w:val="22"/>
+                      <w:szCs w:val="22"/>
+                      <w:lang w:val="en-US"/>
                     </w:rPr>
                     <w:t>5</w:t>
                   </w:r>
@@ -7759,7 +7740,7 @@
               </w:tc>
               <w:tc>
                 <w:tcPr>
-                  <w:tcW w:w="1737" w:type="dxa"/>
+                  <w:tcW w:w="1712" w:type="dxa"/>
                   <w:vAlign w:val="center"/>
                 </w:tcPr>
                 <w:p>
@@ -7775,13 +7756,29 @@
                       <w:sz w:val="22"/>
                       <w:szCs w:val="22"/>
                     </w:rPr>
-                    <w:t>Address</w:t>
-                  </w:r>
-                </w:p>
-              </w:tc>
-              <w:tc>
-                <w:tcPr>
-                  <w:tcW w:w="1517" w:type="dxa"/>
+                    <w:t>Ward/Commune</w:t>
+                  </w:r>
+                </w:p>
+                <w:p>
+                  <w:pPr>
+                    <w:jc w:val="left"/>
+                    <w:rPr>
+                      <w:sz w:val="22"/>
+                      <w:szCs w:val="22"/>
+                    </w:rPr>
+                  </w:pPr>
+                  <w:r>
+                    <w:rPr>
+                      <w:sz w:val="22"/>
+                      <w:szCs w:val="22"/>
+                    </w:rPr>
+                    <w:t>(Phường/Xã)</w:t>
+                  </w:r>
+                </w:p>
+              </w:tc>
+              <w:tc>
+                <w:tcPr>
+                  <w:tcW w:w="1792" w:type="dxa"/>
                   <w:vAlign w:val="center"/>
                 </w:tcPr>
                 <w:p>
@@ -7797,7 +7794,29 @@
                       <w:sz w:val="22"/>
                       <w:szCs w:val="22"/>
                     </w:rPr>
-                    <w:t>Detailed address of the customer attached to</w:t>
+                    <w:t>A ward/commune in that province/city, selectable from a list</w:t>
+                  </w:r>
+                </w:p>
+              </w:tc>
+              <w:tc>
+                <w:tcPr>
+                  <w:tcW w:w="1411" w:type="dxa"/>
+                  <w:vAlign w:val="center"/>
+                </w:tcPr>
+                <w:p>
+                  <w:pPr>
+                    <w:jc w:val="center"/>
+                    <w:rPr>
+                      <w:sz w:val="22"/>
+                      <w:szCs w:val="22"/>
+                    </w:rPr>
+                  </w:pPr>
+                  <w:r>
+                    <w:rPr>
+                      <w:sz w:val="22"/>
+                      <w:szCs w:val="22"/>
+                    </w:rPr>
+                    <w:t>Yes</w:t>
                   </w:r>
                 </w:p>
               </w:tc>
@@ -7808,6 +7827,21 @@
                 </w:tcPr>
                 <w:p>
                   <w:pPr>
+                    <w:jc w:val="left"/>
+                    <w:rPr>
+                      <w:sz w:val="22"/>
+                      <w:szCs w:val="22"/>
+                    </w:rPr>
+                  </w:pPr>
+                </w:p>
+              </w:tc>
+              <w:tc>
+                <w:tcPr>
+                  <w:tcW w:w="1524" w:type="dxa"/>
+                  <w:vAlign w:val="center"/>
+                </w:tcPr>
+                <w:p>
+                  <w:pPr>
                     <w:jc w:val="center"/>
                     <w:rPr>
                       <w:sz w:val="22"/>
@@ -7819,30 +7853,9 @@
                       <w:sz w:val="22"/>
                       <w:szCs w:val="22"/>
                     </w:rPr>
-                    <w:t>Yes</w:t>
-                  </w:r>
-                </w:p>
-              </w:tc>
-              <w:tc>
-                <w:tcPr>
-                  <w:tcW w:w="1614" w:type="dxa"/>
-                  <w:vAlign w:val="center"/>
-                </w:tcPr>
-                <w:p>
-                  <w:pPr>
-                    <w:jc w:val="left"/>
-                    <w:rPr>
-                      <w:sz w:val="22"/>
-                      <w:szCs w:val="22"/>
-                    </w:rPr>
-                  </w:pPr>
-                </w:p>
-              </w:tc>
-              <w:tc>
-                <w:tcPr>
-                  <w:tcW w:w="1561" w:type="dxa"/>
-                  <w:vAlign w:val="center"/>
-                </w:tcPr>
+                    <w:t>Phường Hà Đông</w:t>
+                  </w:r>
+                </w:p>
                 <w:p>
                   <w:pPr>
                     <w:jc w:val="center"/>
@@ -7856,7 +7869,23 @@
                       <w:sz w:val="22"/>
                       <w:szCs w:val="22"/>
                     </w:rPr>
-                    <w:t>199 Chiến Thắng, Triều Khúc</w:t>
+                    <w:t>Xã An Khánh</w:t>
+                  </w:r>
+                </w:p>
+                <w:p>
+                  <w:pPr>
+                    <w:jc w:val="center"/>
+                    <w:rPr>
+                      <w:sz w:val="22"/>
+                      <w:szCs w:val="22"/>
+                    </w:rPr>
+                  </w:pPr>
+                  <w:r>
+                    <w:rPr>
+                      <w:sz w:val="22"/>
+                      <w:szCs w:val="22"/>
+                    </w:rPr>
+                    <w:t>…</w:t>
                   </w:r>
                 </w:p>
               </w:tc>
@@ -7864,7 +7893,7 @@
             <w:tr>
               <w:tc>
                 <w:tcPr>
-                  <w:tcW w:w="533" w:type="dxa"/>
+                  <w:tcW w:w="523" w:type="dxa"/>
                   <w:vAlign w:val="center"/>
                 </w:tcPr>
                 <w:p>
@@ -7873,12 +7902,14 @@
                     <w:rPr>
                       <w:sz w:val="22"/>
                       <w:szCs w:val="22"/>
-                    </w:rPr>
-                  </w:pPr>
-                  <w:r>
-                    <w:rPr>
-                      <w:sz w:val="22"/>
-                      <w:szCs w:val="22"/>
+                      <w:lang w:val="en-US"/>
+                    </w:rPr>
+                  </w:pPr>
+                  <w:r>
+                    <w:rPr>
+                      <w:sz w:val="22"/>
+                      <w:szCs w:val="22"/>
+                      <w:lang w:val="en-US"/>
                     </w:rPr>
                     <w:t>6</w:t>
                   </w:r>
@@ -7886,7 +7917,7 @@
               </w:tc>
               <w:tc>
                 <w:tcPr>
-                  <w:tcW w:w="1737" w:type="dxa"/>
+                  <w:tcW w:w="1712" w:type="dxa"/>
                   <w:vAlign w:val="center"/>
                 </w:tcPr>
                 <w:p>
@@ -7902,13 +7933,13 @@
                       <w:sz w:val="22"/>
                       <w:szCs w:val="22"/>
                     </w:rPr>
-                    <w:t>Delivery method</w:t>
-                  </w:r>
-                </w:p>
-              </w:tc>
-              <w:tc>
-                <w:tcPr>
-                  <w:tcW w:w="1517" w:type="dxa"/>
+                    <w:t>Address</w:t>
+                  </w:r>
+                </w:p>
+              </w:tc>
+              <w:tc>
+                <w:tcPr>
+                  <w:tcW w:w="1792" w:type="dxa"/>
                   <w:vAlign w:val="center"/>
                 </w:tcPr>
                 <w:p>
@@ -7924,7 +7955,29 @@
                       <w:sz w:val="22"/>
                       <w:szCs w:val="22"/>
                     </w:rPr>
-                    <w:t>How the products should be delivered to the customer</w:t>
+                    <w:t>Detailed address of the customer attached to</w:t>
+                  </w:r>
+                </w:p>
+              </w:tc>
+              <w:tc>
+                <w:tcPr>
+                  <w:tcW w:w="1411" w:type="dxa"/>
+                  <w:vAlign w:val="center"/>
+                </w:tcPr>
+                <w:p>
+                  <w:pPr>
+                    <w:jc w:val="center"/>
+                    <w:rPr>
+                      <w:sz w:val="22"/>
+                      <w:szCs w:val="22"/>
+                    </w:rPr>
+                  </w:pPr>
+                  <w:r>
+                    <w:rPr>
+                      <w:sz w:val="22"/>
+                      <w:szCs w:val="22"/>
+                    </w:rPr>
+                    <w:t>Yes</w:t>
                   </w:r>
                 </w:p>
               </w:tc>
@@ -7935,10 +7988,49 @@
                 </w:tcPr>
                 <w:p>
                   <w:pPr>
+                    <w:jc w:val="left"/>
+                    <w:rPr>
+                      <w:sz w:val="22"/>
+                      <w:szCs w:val="22"/>
+                    </w:rPr>
+                  </w:pPr>
+                </w:p>
+              </w:tc>
+              <w:tc>
+                <w:tcPr>
+                  <w:tcW w:w="1524" w:type="dxa"/>
+                  <w:vAlign w:val="center"/>
+                </w:tcPr>
+                <w:p>
+                  <w:pPr>
                     <w:jc w:val="center"/>
                     <w:rPr>
                       <w:sz w:val="22"/>
                       <w:szCs w:val="22"/>
+                    </w:rPr>
+                  </w:pPr>
+                  <w:r>
+                    <w:rPr>
+                      <w:sz w:val="22"/>
+                      <w:szCs w:val="22"/>
+                    </w:rPr>
+                    <w:t>199 Chiến Thắng, Triều Khúc</w:t>
+                  </w:r>
+                </w:p>
+              </w:tc>
+            </w:tr>
+            <w:tr>
+              <w:tc>
+                <w:tcPr>
+                  <w:tcW w:w="523" w:type="dxa"/>
+                  <w:vAlign w:val="center"/>
+                </w:tcPr>
+                <w:p>
+                  <w:pPr>
+                    <w:jc w:val="center"/>
+                    <w:rPr>
+                      <w:sz w:val="22"/>
+                      <w:szCs w:val="22"/>
                       <w:lang w:val="en-US"/>
                     </w:rPr>
                   </w:pPr>
@@ -7948,13 +8040,81 @@
                       <w:szCs w:val="22"/>
                       <w:lang w:val="en-US"/>
                     </w:rPr>
+                    <w:t>7</w:t>
+                  </w:r>
+                </w:p>
+              </w:tc>
+              <w:tc>
+                <w:tcPr>
+                  <w:tcW w:w="1712" w:type="dxa"/>
+                  <w:vAlign w:val="center"/>
+                </w:tcPr>
+                <w:p>
+                  <w:pPr>
+                    <w:jc w:val="left"/>
+                    <w:rPr>
+                      <w:sz w:val="22"/>
+                      <w:szCs w:val="22"/>
+                    </w:rPr>
+                  </w:pPr>
+                  <w:r>
+                    <w:rPr>
+                      <w:sz w:val="22"/>
+                      <w:szCs w:val="22"/>
+                    </w:rPr>
+                    <w:t>Delivery method</w:t>
+                  </w:r>
+                </w:p>
+              </w:tc>
+              <w:tc>
+                <w:tcPr>
+                  <w:tcW w:w="1792" w:type="dxa"/>
+                  <w:vAlign w:val="center"/>
+                </w:tcPr>
+                <w:p>
+                  <w:pPr>
+                    <w:jc w:val="left"/>
+                    <w:rPr>
+                      <w:sz w:val="22"/>
+                      <w:szCs w:val="22"/>
+                    </w:rPr>
+                  </w:pPr>
+                  <w:r>
+                    <w:rPr>
+                      <w:sz w:val="22"/>
+                      <w:szCs w:val="22"/>
+                    </w:rPr>
+                    <w:t>How the products should be delivered to the customer</w:t>
+                  </w:r>
+                </w:p>
+              </w:tc>
+              <w:tc>
+                <w:tcPr>
+                  <w:tcW w:w="1411" w:type="dxa"/>
+                  <w:vAlign w:val="center"/>
+                </w:tcPr>
+                <w:p>
+                  <w:pPr>
+                    <w:jc w:val="center"/>
+                    <w:rPr>
+                      <w:sz w:val="22"/>
+                      <w:szCs w:val="22"/>
+                      <w:lang w:val="en-US"/>
+                    </w:rPr>
+                  </w:pPr>
+                  <w:r>
+                    <w:rPr>
+                      <w:sz w:val="22"/>
+                      <w:szCs w:val="22"/>
+                      <w:lang w:val="en-US"/>
+                    </w:rPr>
                     <w:t>Yes</w:t>
                   </w:r>
                 </w:p>
               </w:tc>
               <w:tc>
                 <w:tcPr>
-                  <w:tcW w:w="1614" w:type="dxa"/>
+                  <w:tcW w:w="1442" w:type="dxa"/>
                   <w:vAlign w:val="center"/>
                 </w:tcPr>
                 <w:p>
@@ -7969,7 +8129,7 @@
               </w:tc>
               <w:tc>
                 <w:tcPr>
-                  <w:tcW w:w="1561" w:type="dxa"/>
+                  <w:tcW w:w="1524" w:type="dxa"/>
                   <w:vAlign w:val="center"/>
                 </w:tcPr>
                 <w:p>
@@ -8326,6 +8486,7 @@
                       <w:sz w:val="22"/>
                       <w:szCs w:val="22"/>
                     </w:rPr>
+                    <w:lastRenderedPageBreak/>
                     <w:t>DVD</w:t>
                   </w:r>
                   <w:r>
@@ -8373,6 +8534,7 @@
                       <w:sz w:val="22"/>
                       <w:szCs w:val="22"/>
                     </w:rPr>
+                    <w:lastRenderedPageBreak/>
                     <w:t>2</w:t>
                   </w:r>
                 </w:p>
@@ -9658,6 +9820,7 @@
                       <w:sz w:val="22"/>
                       <w:szCs w:val="22"/>
                     </w:rPr>
+                    <w:lastRenderedPageBreak/>
                     <w:t>012.34.56.789</w:t>
                   </w:r>
                 </w:p>
@@ -9698,6 +9861,7 @@
                       <w:sz w:val="22"/>
                       <w:szCs w:val="22"/>
                     </w:rPr>
+                    <w:lastRenderedPageBreak/>
                     <w:t>3</w:t>
                   </w:r>
                 </w:p>
@@ -10753,8 +10917,16 @@
             </w:r>
           </w:p>
           <w:p>
-            <w:r>
-              <w:t>The use case can be considered successful if all the following conditions are satisfied:</w:t>
+            <w:pPr>
+              <w:pStyle w:val="ListParagraph"/>
+              <w:numPr>
+                <w:ilvl w:val="0"/>
+                <w:numId w:val="8"/>
+              </w:numPr>
+              <w:spacing w:before="0" w:after="160" w:line="259" w:lineRule="auto"/>
+            </w:pPr>
+            <w:r>
+              <w:t>A new order is created in the system and its status is set to Pending.</w:t>
             </w:r>
           </w:p>
           <w:p>
@@ -10767,7 +10939,10 @@
               <w:spacing w:before="0" w:after="160" w:line="259" w:lineRule="auto"/>
             </w:pPr>
             <w:r>
-              <w:t>A new order is created in the system and its status is set to Pending.</w:t>
+              <w:t xml:space="preserve">The system records </w:t>
+            </w:r>
+            <w:r>
+              <w:t>payment transaction information and the successfully paid order</w:t>
             </w:r>
           </w:p>
           <w:p>
@@ -10780,22 +10955,6 @@
               <w:spacing w:before="0" w:after="160" w:line="259" w:lineRule="auto"/>
             </w:pPr>
             <w:r>
-              <w:t xml:space="preserve">The system records </w:t>
-            </w:r>
-            <w:r>
-              <w:t>payment transaction information and the successfully paid order</w:t>
-            </w:r>
-          </w:p>
-          <w:p>
-            <w:pPr>
-              <w:pStyle w:val="ListParagraph"/>
-              <w:numPr>
-                <w:ilvl w:val="0"/>
-                <w:numId w:val="8"/>
-              </w:numPr>
-              <w:spacing w:before="0" w:after="160" w:line="259" w:lineRule="auto"/>
-            </w:pPr>
-            <w:r>
               <w:t>Customer receives email containing invoice and payment transaction information</w:t>
             </w:r>
           </w:p>
@@ -10821,11 +10980,12 @@
         <w:rPr>
           <w:noProof/>
         </w:rPr>
+        <w:lastRenderedPageBreak/>
         <w:drawing>
-          <wp:inline distT="0" distB="0" distL="0" distR="0" wp14:anchorId="7A474C05" wp14:editId="5CDD335A">
-            <wp:extent cx="4931468" cy="7840980"/>
-            <wp:effectExtent l="0" t="0" r="2540" b="7620"/>
-            <wp:docPr id="1117601700" name="Picture 1"/>
+          <wp:inline distT="0" distB="0" distL="0" distR="0" wp14:anchorId="7C4F79FA" wp14:editId="0D17E919">
+            <wp:extent cx="4977560" cy="7917180"/>
+            <wp:effectExtent l="0" t="0" r="0" b="7620"/>
+            <wp:docPr id="1252420110" name="Picture 1"/>
             <wp:cNvGraphicFramePr>
               <a:graphicFrameLocks xmlns:a="http://schemas.openxmlformats.org/drawingml/2006/main" noChangeAspect="1"/>
             </wp:cNvGraphicFramePr>
@@ -10854,7 +11014,7 @@
                   <pic:spPr bwMode="auto">
                     <a:xfrm>
                       <a:off x="0" y="0"/>
-                      <a:ext cx="4936366" cy="7848768"/>
+                      <a:ext cx="4978464" cy="7918618"/>
                     </a:xfrm>
                     <a:prstGeom prst="rect">
                       <a:avLst/>
@@ -10905,6 +11065,7 @@
         <w:rPr>
           <w:lang w:val="vi-VN"/>
         </w:rPr>
+        <w:lastRenderedPageBreak/>
         <w:t xml:space="preserve">Use case </w:t>
       </w:r>
       <w:r>
@@ -11819,35 +11980,7 @@
                     <w:rPr>
                       <w:sz w:val="20"/>
                     </w:rPr>
-                    <w:t xml:space="preserve">If the customer </w:t>
-                  </w:r>
-                  <w:proofErr w:type="gramStart"/>
-                  <w:r>
-                    <w:rPr>
-                      <w:sz w:val="20"/>
-                    </w:rPr>
-                    <w:t>choose</w:t>
-                  </w:r>
-                  <w:proofErr w:type="gramEnd"/>
-                  <w:r>
-                    <w:rPr>
-                      <w:sz w:val="20"/>
-                    </w:rPr>
-                    <w:t xml:space="preserve"> to </w:t>
-                  </w:r>
-                  <w:proofErr w:type="gramStart"/>
-                  <w:r>
-                    <w:rPr>
-                      <w:sz w:val="20"/>
-                    </w:rPr>
-                    <w:t>pay</w:t>
-                  </w:r>
-                  <w:proofErr w:type="gramEnd"/>
-                  <w:r>
-                    <w:rPr>
-                      <w:sz w:val="20"/>
-                    </w:rPr>
-                    <w:t xml:space="preserve"> order by credit card</w:t>
+                    <w:t>If the customer choose to pay order by credit card</w:t>
                   </w:r>
                 </w:p>
               </w:tc>
@@ -11922,6 +12055,7 @@
                       <w:spacing w:val="-5"/>
                       <w:sz w:val="20"/>
                     </w:rPr>
+                    <w:lastRenderedPageBreak/>
                     <w:t>2.</w:t>
                   </w:r>
                 </w:p>
@@ -13212,6 +13346,7 @@
                     <w:rPr>
                       <w:lang w:val="en-US"/>
                     </w:rPr>
+                    <w:lastRenderedPageBreak/>
                     <w:t xml:space="preserve">- </w:t>
                   </w:r>
                   <w:r>
@@ -13232,6 +13367,7 @@
                     <w:rPr>
                       <w:lang w:val="en-US"/>
                     </w:rPr>
+                    <w:lastRenderedPageBreak/>
                     <w:t>1</w:t>
                   </w:r>
                   <w:r>
@@ -15023,23 +15159,7 @@
               <w:t>software will display general information of the order</w:t>
             </w:r>
             <w:r>
-              <w:t xml:space="preserve"> and transaction </w:t>
-            </w:r>
-            <w:proofErr w:type="gramStart"/>
-            <w:r>
-              <w:t>information, and</w:t>
-            </w:r>
-            <w:proofErr w:type="gramEnd"/>
-            <w:r>
-              <w:t xml:space="preserve"> then send </w:t>
-            </w:r>
-            <w:proofErr w:type="gramStart"/>
-            <w:r>
-              <w:t>invoice</w:t>
-            </w:r>
-            <w:proofErr w:type="gramEnd"/>
-            <w:r>
-              <w:t xml:space="preserve"> with </w:t>
+              <w:t xml:space="preserve"> and transaction information, and then send invoice with </w:t>
             </w:r>
             <w:r>
               <w:t>payment transaction information to the customer's email</w:t>
@@ -15061,6 +15181,10 @@
         </w:rPr>
       </w:pPr>
       <w:r>
+        <w:rPr>
+          <w:noProof/>
+        </w:rPr>
+        <w:lastRenderedPageBreak/>
         <w:drawing>
           <wp:inline distT="0" distB="0" distL="0" distR="0" wp14:anchorId="32975C2E" wp14:editId="508A3D4A">
             <wp:extent cx="5486400" cy="4079875"/>
@@ -15119,6 +15243,7 @@
       </w:pPr>
       <w:bookmarkStart w:id="18" w:name="_Toc224597117"/>
       <w:r>
+        <w:lastRenderedPageBreak/>
         <w:t>Use case UC003 – Pay Order by Credit Card</w:t>
       </w:r>
       <w:bookmarkEnd w:id="18"/>
@@ -15640,25 +15765,7 @@
                 <w:szCs w:val="24"/>
                 <w:lang w:val="en-US"/>
               </w:rPr>
-              <w:t xml:space="preserve">AIMS Software displays general information </w:t>
-            </w:r>
-            <w:proofErr w:type="gramStart"/>
-            <w:r>
-              <w:rPr>
-                <w:rFonts w:eastAsia="Times New Roman"/>
-                <w:szCs w:val="24"/>
-                <w:lang w:val="en-US"/>
-              </w:rPr>
-              <w:t>of</w:t>
-            </w:r>
-            <w:proofErr w:type="gramEnd"/>
-            <w:r>
-              <w:rPr>
-                <w:rFonts w:eastAsia="Times New Roman"/>
-                <w:szCs w:val="24"/>
-                <w:lang w:val="en-US"/>
-              </w:rPr>
-              <w:t xml:space="preserve"> the order (customer name, phone number, shipping address, province, total amount) and transaction information (transaction ID, transaction content and transaction datetime).</w:t>
+              <w:t>AIMS Software displays general information of the order (customer name, phone number, shipping address, province, total amount) and transaction information (transaction ID, transaction content and transaction datetime).</w:t>
             </w:r>
           </w:p>
           <w:p>
@@ -15716,6 +15823,7 @@
                 <w:sz w:val="28"/>
                 <w:szCs w:val="28"/>
               </w:rPr>
+              <w:lastRenderedPageBreak/>
               <w:t>Alternative flows</w:t>
             </w:r>
           </w:p>
@@ -17858,6 +17966,7 @@
                       <w:rFonts w:eastAsia="Times New Roman"/>
                       <w:sz w:val="20"/>
                     </w:rPr>
+                    <w:lastRenderedPageBreak/>
                     <w:t>1</w:t>
                   </w:r>
                 </w:p>
@@ -18821,6 +18930,7 @@
         <w:rPr>
           <w:noProof/>
         </w:rPr>
+        <w:lastRenderedPageBreak/>
         <w:drawing>
           <wp:inline distT="0" distB="0" distL="0" distR="0" wp14:anchorId="343A09A8" wp14:editId="197A9222">
             <wp:extent cx="5486400" cy="1943100"/>
@@ -18981,6 +19091,7 @@
               </w:rPr>
             </w:pPr>
             <w:r>
+              <w:lastRenderedPageBreak/>
               <w:t>UC00</w:t>
             </w:r>
             <w:r>
@@ -19417,6 +19528,7 @@
               <w:rPr>
                 <w:rFonts w:hAnsi="Symbol"/>
               </w:rPr>
+              <w:lastRenderedPageBreak/>
               <w:t>Step 3:</w:t>
             </w:r>
             <w:r>
@@ -19560,7 +19672,7 @@
             <w:pPr>
               <w:pStyle w:val="NormalWeb"/>
               <w:rPr>
-                <w:rFonts w:hAnsi="Symbol"/>
+                <w:rFonts w:hAnsi="Symbol" w:hint="eastAsia"/>
               </w:rPr>
             </w:pPr>
             <w:r>
@@ -20030,6 +20142,7 @@
                 </w:tcPr>
                 <w:p>
                   <w:r>
+                    <w:lastRenderedPageBreak/>
                     <w:t>4</w:t>
                   </w:r>
                 </w:p>
@@ -21074,6 +21187,7 @@
                 </w:tcPr>
                 <w:p>
                   <w:r>
+                    <w:lastRenderedPageBreak/>
                     <w:t>1</w:t>
                   </w:r>
                 </w:p>
@@ -22162,6 +22276,7 @@
                 </w:tcPr>
                 <w:p>
                   <w:r>
+                    <w:lastRenderedPageBreak/>
                     <w:t>3</w:t>
                   </w:r>
                 </w:p>
@@ -22964,6 +23079,7 @@
                 </w:tcPr>
                 <w:p>
                   <w:r>
+                    <w:lastRenderedPageBreak/>
                     <w:t>2</w:t>
                   </w:r>
                 </w:p>
@@ -23642,6 +23758,7 @@
                     <w:jc w:val="left"/>
                   </w:pPr>
                   <w:r>
+                    <w:lastRenderedPageBreak/>
                     <w:t>5</w:t>
                   </w:r>
                 </w:p>
@@ -24917,6 +25034,7 @@
                 <w:iCs/>
                 <w:sz w:val="20"/>
               </w:rPr>
+              <w:lastRenderedPageBreak/>
               <w:t xml:space="preserve">Table </w:t>
             </w:r>
             <w:r>
@@ -26076,6 +26194,7 @@
           <w:noProof/>
           <w:lang w:val="vi-VN"/>
         </w:rPr>
+        <w:lastRenderedPageBreak/>
         <w:drawing>
           <wp:inline distT="0" distB="0" distL="0" distR="0" wp14:anchorId="0A1950DE" wp14:editId="7AA902D6">
             <wp:extent cx="5486400" cy="5792470"/>
@@ -26157,6 +26276,7 @@
           <w:noProof/>
           <w:lang w:val="vi-VN"/>
         </w:rPr>
+        <w:lastRenderedPageBreak/>
         <w:drawing>
           <wp:inline distT="0" distB="0" distL="0" distR="0" wp14:anchorId="55055A00" wp14:editId="488995B1">
             <wp:extent cx="5486400" cy="6671945"/>
@@ -26225,6 +26345,7 @@
         <w:rPr>
           <w:noProof/>
         </w:rPr>
+        <w:lastRenderedPageBreak/>
         <w:drawing>
           <wp:inline distT="0" distB="0" distL="0" distR="0" wp14:anchorId="27BA4E20" wp14:editId="4CE412C3">
             <wp:extent cx="5486400" cy="5135245"/>
@@ -26300,6 +26421,7 @@
       </w:pPr>
       <w:bookmarkStart w:id="20" w:name="_Toc224597119"/>
       <w:r>
+        <w:lastRenderedPageBreak/>
         <w:t>Supplementary specification</w:t>
       </w:r>
       <w:bookmarkEnd w:id="20"/>
@@ -26712,15 +26834,7 @@
         <w:ind w:left="504"/>
       </w:pPr>
       <w:r>
-        <w:t xml:space="preserve">The system </w:t>
-      </w:r>
-      <w:proofErr w:type="gramStart"/>
-      <w:r>
-        <w:t>shall</w:t>
-      </w:r>
-      <w:proofErr w:type="gramEnd"/>
-      <w:r>
-        <w:t xml:space="preserve"> provide easy-to-use navigation to help users accomplish their tasks</w:t>
+        <w:t>The system shall provide easy-to-use navigation to help users accomplish their tasks</w:t>
       </w:r>
     </w:p>
     <w:p>
@@ -26733,15 +26847,7 @@
         <w:ind w:left="504"/>
       </w:pPr>
       <w:r>
-        <w:t xml:space="preserve">The system </w:t>
-      </w:r>
-      <w:proofErr w:type="gramStart"/>
-      <w:r>
-        <w:t>shall</w:t>
-      </w:r>
-      <w:proofErr w:type="gramEnd"/>
-      <w:r>
-        <w:t xml:space="preserve"> not require </w:t>
+        <w:t xml:space="preserve">The system shall not require </w:t>
       </w:r>
       <w:r>
         <w:t xml:space="preserve">users to </w:t>
@@ -26841,6 +26947,7 @@
       </w:pPr>
       <w:bookmarkStart w:id="24" w:name="_Toc224597123"/>
       <w:r>
+        <w:lastRenderedPageBreak/>
         <w:t>Performance</w:t>
       </w:r>
       <w:bookmarkEnd w:id="24"/>
@@ -26948,15 +27055,7 @@
         <w:ind w:left="504"/>
       </w:pPr>
       <w:r>
-        <w:t xml:space="preserve">The system </w:t>
-      </w:r>
-      <w:proofErr w:type="gramStart"/>
-      <w:r>
-        <w:t>shall</w:t>
-      </w:r>
-      <w:proofErr w:type="gramEnd"/>
-      <w:r>
-        <w:t xml:space="preserve"> not allow the product manager to delete more than 20 products per day</w:t>
+        <w:t>The system shall not allow the product manager to delete more than 20 products per day</w:t>
       </w:r>
     </w:p>
     <w:p>
@@ -33106,6 +33205,19 @@
 </file>
 
 <file path=customXml/item1.xml><?xml version="1.0" encoding="utf-8"?>
+<b:Sources xmlns:b="http://schemas.openxmlformats.org/officeDocument/2006/bibliography" xmlns="http://schemas.openxmlformats.org/officeDocument/2006/bibliography" SelectedStyle="\APASixthEditionOfficeOnline.xsl" StyleName="APA" Version="6"/>
+</file>
+
+<file path=customXml/item2.xml><?xml version="1.0" encoding="utf-8"?>
+<?mso-contentType ?>
+<FormTemplates xmlns="http://schemas.microsoft.com/sharepoint/v3/contenttype/forms">
+  <Display>DocumentLibraryForm</Display>
+  <Edit>DocumentLibraryForm</Edit>
+  <New>DocumentLibraryForm</New>
+</FormTemplates>
+</file>
+
+<file path=customXml/item3.xml><?xml version="1.0" encoding="utf-8"?>
 <ct:contentTypeSchema xmlns:ct="http://schemas.microsoft.com/office/2006/metadata/contentType" xmlns:ma="http://schemas.microsoft.com/office/2006/metadata/properties/metaAttributes" ct:_="" ma:_="" ma:contentTypeName="Document" ma:contentTypeID="0x010100CEB410CF44B9F94DA0FE6BF7E65A0904" ma:contentTypeVersion="3" ma:contentTypeDescription="Create a new document." ma:contentTypeScope="" ma:versionID="d4a3d150d5290d1a71260648fa0a71db">
   <xsd:schema xmlns:xsd="http://www.w3.org/2001/XMLSchema" xmlns:xs="http://www.w3.org/2001/XMLSchema" xmlns:p="http://schemas.microsoft.com/office/2006/metadata/properties" xmlns:ns2="37aacdc0-cdcb-42f5-a85d-c756599e7b09" targetNamespace="http://schemas.microsoft.com/office/2006/metadata/properties" ma:root="true" ma:fieldsID="099df1950c9fa7586d90b31dc4c0d5bc" ns2:_="">
     <xsd:import namespace="37aacdc0-cdcb-42f5-a85d-c756599e7b09"/>
@@ -33243,19 +33355,6 @@
 </ct:contentTypeSchema>
 </file>
 
-<file path=customXml/item2.xml><?xml version="1.0" encoding="utf-8"?>
-<?mso-contentType ?>
-<FormTemplates xmlns="http://schemas.microsoft.com/sharepoint/v3/contenttype/forms">
-  <Display>DocumentLibraryForm</Display>
-  <Edit>DocumentLibraryForm</Edit>
-  <New>DocumentLibraryForm</New>
-</FormTemplates>
-</file>
-
-<file path=customXml/item3.xml><?xml version="1.0" encoding="utf-8"?>
-<b:Sources xmlns:b="http://schemas.openxmlformats.org/officeDocument/2006/bibliography" xmlns="http://schemas.openxmlformats.org/officeDocument/2006/bibliography" SelectedStyle="\APASixthEditionOfficeOnline.xsl" StyleName="APA" Version="6"/>
-</file>
-
 <file path=customXml/item4.xml><?xml version="1.0" encoding="utf-8"?>
 <p:properties xmlns:p="http://schemas.microsoft.com/office/2006/metadata/properties" xmlns:xsi="http://www.w3.org/2001/XMLSchema-instance" xmlns:pc="http://schemas.microsoft.com/office/infopath/2007/PartnerControls">
   <documentManagement/>
@@ -33263,6 +33362,22 @@
 </file>
 
 <file path=customXml/itemProps1.xml><?xml version="1.0" encoding="utf-8"?>
+<ds:datastoreItem xmlns:ds="http://schemas.openxmlformats.org/officeDocument/2006/customXml" ds:itemID="{7BBDEB9B-FEAA-4C39-9876-C44434EC0138}">
+  <ds:schemaRefs>
+    <ds:schemaRef ds:uri="http://schemas.openxmlformats.org/officeDocument/2006/bibliography"/>
+  </ds:schemaRefs>
+</ds:datastoreItem>
+</file>
+
+<file path=customXml/itemProps2.xml><?xml version="1.0" encoding="utf-8"?>
+<ds:datastoreItem xmlns:ds="http://schemas.openxmlformats.org/officeDocument/2006/customXml" ds:itemID="{2B84F465-9B47-4EE7-9BEB-A766E8F94242}">
+  <ds:schemaRefs>
+    <ds:schemaRef ds:uri="http://schemas.microsoft.com/sharepoint/v3/contenttype/forms"/>
+  </ds:schemaRefs>
+</ds:datastoreItem>
+</file>
+
+<file path=customXml/itemProps3.xml><?xml version="1.0" encoding="utf-8"?>
 <ds:datastoreItem xmlns:ds="http://schemas.openxmlformats.org/officeDocument/2006/customXml" ds:itemID="{42CCB020-1BC0-4E34-8C55-5450D29688ED}">
   <ds:schemaRefs>
     <ds:schemaRef ds:uri="http://schemas.microsoft.com/office/2006/metadata/contentType"/>
@@ -33280,22 +33395,6 @@
 </ds:datastoreItem>
 </file>
 
-<file path=customXml/itemProps2.xml><?xml version="1.0" encoding="utf-8"?>
-<ds:datastoreItem xmlns:ds="http://schemas.openxmlformats.org/officeDocument/2006/customXml" ds:itemID="{2B84F465-9B47-4EE7-9BEB-A766E8F94242}">
-  <ds:schemaRefs>
-    <ds:schemaRef ds:uri="http://schemas.microsoft.com/sharepoint/v3/contenttype/forms"/>
-  </ds:schemaRefs>
-</ds:datastoreItem>
-</file>
-
-<file path=customXml/itemProps3.xml><?xml version="1.0" encoding="utf-8"?>
-<ds:datastoreItem xmlns:ds="http://schemas.openxmlformats.org/officeDocument/2006/customXml" ds:itemID="{7BBDEB9B-FEAA-4C39-9876-C44434EC0138}">
-  <ds:schemaRefs>
-    <ds:schemaRef ds:uri="http://schemas.openxmlformats.org/officeDocument/2006/bibliography"/>
-  </ds:schemaRefs>
-</ds:datastoreItem>
-</file>
-
 <file path=customXml/itemProps4.xml><?xml version="1.0" encoding="utf-8"?>
 <ds:datastoreItem xmlns:ds="http://schemas.openxmlformats.org/officeDocument/2006/customXml" ds:itemID="{99C051D8-2C2B-411B-8E96-F777845A689B}">
   <ds:schemaRefs>

</xml_diff>

<commit_message>
fix: use case diagram
</commit_message>
<xml_diff>
--- a/RequirementAnalysis/SRS/[TEAM-16]SoftwareRequirementSpecification-[Ver1.2].docx
+++ b/RequirementAnalysis/SRS/[TEAM-16]SoftwareRequirementSpecification-[Ver1.2].docx
@@ -476,13 +476,23 @@
         <w:t xml:space="preserve"> </w:t>
       </w:r>
       <w:bookmarkStart w:id="2" w:name="_Toc61315196"/>
+      <w:proofErr w:type="gramStart"/>
       <w:r>
         <w:rPr>
           <w:rFonts w:ascii="Arial" w:hAnsi="Arial" w:cs="Arial"/>
           <w:i/>
           <w:sz w:val="28"/>
         </w:rPr>
-        <w:t>March, 2026</w:t>
+        <w:t>March,</w:t>
+      </w:r>
+      <w:proofErr w:type="gramEnd"/>
+      <w:r>
+        <w:rPr>
+          <w:rFonts w:ascii="Arial" w:hAnsi="Arial" w:cs="Arial"/>
+          <w:i/>
+          <w:sz w:val="28"/>
+        </w:rPr>
+        <w:t xml:space="preserve"> 2026</w:t>
       </w:r>
     </w:p>
     <w:p>
@@ -3080,7 +3090,25 @@
                 <w:color w:val="303030"/>
                 <w:sz w:val="20"/>
               </w:rPr>
-              <w:t>Stands for "An Internet Media Store", an e-commerce software that supports the buying and selling of physical media products</w:t>
+              <w:t xml:space="preserve">Stands for "An Internet Media Store", </w:t>
+            </w:r>
+            <w:proofErr w:type="gramStart"/>
+            <w:r>
+              <w:rPr>
+                <w:rFonts w:eastAsia="Times New Roman"/>
+                <w:color w:val="303030"/>
+                <w:sz w:val="20"/>
+              </w:rPr>
+              <w:t>an e</w:t>
+            </w:r>
+            <w:proofErr w:type="gramEnd"/>
+            <w:r>
+              <w:rPr>
+                <w:rFonts w:eastAsia="Times New Roman"/>
+                <w:color w:val="303030"/>
+                <w:sz w:val="20"/>
+              </w:rPr>
+              <w:t>-commerce software that supports the buying and selling of physical media products</w:t>
             </w:r>
           </w:p>
         </w:tc>
@@ -3397,7 +3425,23 @@
                 <w:color w:val="303030"/>
                 <w:sz w:val="20"/>
               </w:rPr>
-              <w:t>Value Added Tax. The system strictly applies a 10% VAT for all physical media items</w:t>
+              <w:t xml:space="preserve">Value Added Tax. The system strictly applies </w:t>
+            </w:r>
+            <w:proofErr w:type="gramStart"/>
+            <w:r>
+              <w:rPr>
+                <w:color w:val="303030"/>
+                <w:sz w:val="20"/>
+              </w:rPr>
+              <w:t>a 10</w:t>
+            </w:r>
+            <w:proofErr w:type="gramEnd"/>
+            <w:r>
+              <w:rPr>
+                <w:color w:val="303030"/>
+                <w:sz w:val="20"/>
+              </w:rPr>
+              <w:t>% VAT for all physical media items</w:t>
             </w:r>
           </w:p>
         </w:tc>
@@ -4641,7 +4685,23 @@
                       <w:color w:val="303030"/>
                       <w:sz w:val="20"/>
                     </w:rPr>
-                    <w:t xml:space="preserve"> APIs. The token perform payment-related requests.</w:t>
+                    <w:t xml:space="preserve"> APIs. The token </w:t>
+                  </w:r>
+                  <w:proofErr w:type="gramStart"/>
+                  <w:r>
+                    <w:rPr>
+                      <w:color w:val="303030"/>
+                      <w:sz w:val="20"/>
+                    </w:rPr>
+                    <w:t>perform</w:t>
+                  </w:r>
+                  <w:proofErr w:type="gramEnd"/>
+                  <w:r>
+                    <w:rPr>
+                      <w:color w:val="303030"/>
+                      <w:sz w:val="20"/>
+                    </w:rPr>
+                    <w:t xml:space="preserve"> payment-related requests.</w:t>
                   </w:r>
                 </w:p>
               </w:tc>
@@ -4763,10 +4823,22 @@
           <w:b/>
           <w:bCs/>
         </w:rPr>
-        <w:t>Software Requirements Specification (SRS)</w:t>
-      </w:r>
-      <w:r>
-        <w:t>,Software Engineering Course Materials, Hanoi University of Science and Technology.</w:t>
+        <w:t>Software Requirements Specification (SRS</w:t>
+      </w:r>
+      <w:proofErr w:type="gramStart"/>
+      <w:r>
+        <w:rPr>
+          <w:b/>
+          <w:bCs/>
+        </w:rPr>
+        <w:t>)</w:t>
+      </w:r>
+      <w:r>
+        <w:t>,Software</w:t>
+      </w:r>
+      <w:proofErr w:type="gramEnd"/>
+      <w:r>
+        <w:t xml:space="preserve"> Engineering Course Materials, Hanoi University of Science and Technology.</w:t>
       </w:r>
     </w:p>
     <w:p>
@@ -5144,10 +5216,10 @@
           <w:noProof/>
         </w:rPr>
         <w:drawing>
-          <wp:inline distT="0" distB="0" distL="0" distR="0" wp14:anchorId="43181FBA" wp14:editId="413CE800">
+          <wp:inline distT="0" distB="0" distL="0" distR="0" wp14:anchorId="3720A528" wp14:editId="54C9ADEB">
             <wp:extent cx="5486400" cy="6254115"/>
             <wp:effectExtent l="0" t="0" r="0" b="0"/>
-            <wp:docPr id="1581150642" name="Picture 1"/>
+            <wp:docPr id="1673840198" name="Picture 1"/>
             <wp:cNvGraphicFramePr>
               <a:graphicFrameLocks xmlns:a="http://schemas.openxmlformats.org/drawingml/2006/main" noChangeAspect="1"/>
             </wp:cNvGraphicFramePr>
@@ -11980,7 +12052,35 @@
                     <w:rPr>
                       <w:sz w:val="20"/>
                     </w:rPr>
-                    <w:t>If the customer choose to pay order by credit card</w:t>
+                    <w:t xml:space="preserve">If the customer </w:t>
+                  </w:r>
+                  <w:proofErr w:type="gramStart"/>
+                  <w:r>
+                    <w:rPr>
+                      <w:sz w:val="20"/>
+                    </w:rPr>
+                    <w:t>choose</w:t>
+                  </w:r>
+                  <w:proofErr w:type="gramEnd"/>
+                  <w:r>
+                    <w:rPr>
+                      <w:sz w:val="20"/>
+                    </w:rPr>
+                    <w:t xml:space="preserve"> to </w:t>
+                  </w:r>
+                  <w:proofErr w:type="gramStart"/>
+                  <w:r>
+                    <w:rPr>
+                      <w:sz w:val="20"/>
+                    </w:rPr>
+                    <w:t>pay</w:t>
+                  </w:r>
+                  <w:proofErr w:type="gramEnd"/>
+                  <w:r>
+                    <w:rPr>
+                      <w:sz w:val="20"/>
+                    </w:rPr>
+                    <w:t xml:space="preserve"> order by credit card</w:t>
                   </w:r>
                 </w:p>
               </w:tc>
@@ -15765,7 +15865,25 @@
                 <w:szCs w:val="24"/>
                 <w:lang w:val="en-US"/>
               </w:rPr>
-              <w:t>AIMS Software displays general information of the order (customer name, phone number, shipping address, province, total amount) and transaction information (transaction ID, transaction content and transaction datetime).</w:t>
+              <w:t xml:space="preserve">AIMS Software displays general information </w:t>
+            </w:r>
+            <w:proofErr w:type="gramStart"/>
+            <w:r>
+              <w:rPr>
+                <w:rFonts w:eastAsia="Times New Roman"/>
+                <w:szCs w:val="24"/>
+                <w:lang w:val="en-US"/>
+              </w:rPr>
+              <w:t>of</w:t>
+            </w:r>
+            <w:proofErr w:type="gramEnd"/>
+            <w:r>
+              <w:rPr>
+                <w:rFonts w:eastAsia="Times New Roman"/>
+                <w:szCs w:val="24"/>
+                <w:lang w:val="en-US"/>
+              </w:rPr>
+              <w:t xml:space="preserve"> the order (customer name, phone number, shipping address, province, total amount) and transaction information (transaction ID, transaction content and transaction datetime).</w:t>
             </w:r>
           </w:p>
           <w:p>
@@ -26834,7 +26952,15 @@
         <w:ind w:left="504"/>
       </w:pPr>
       <w:r>
-        <w:t>The system shall provide easy-to-use navigation to help users accomplish their tasks</w:t>
+        <w:t xml:space="preserve">The system </w:t>
+      </w:r>
+      <w:proofErr w:type="gramStart"/>
+      <w:r>
+        <w:t>shall</w:t>
+      </w:r>
+      <w:proofErr w:type="gramEnd"/>
+      <w:r>
+        <w:t xml:space="preserve"> provide easy-to-use navigation to help users accomplish their tasks</w:t>
       </w:r>
     </w:p>
     <w:p>
@@ -26847,7 +26973,15 @@
         <w:ind w:left="504"/>
       </w:pPr>
       <w:r>
-        <w:t xml:space="preserve">The system shall not require </w:t>
+        <w:t xml:space="preserve">The system </w:t>
+      </w:r>
+      <w:proofErr w:type="gramStart"/>
+      <w:r>
+        <w:t>shall</w:t>
+      </w:r>
+      <w:proofErr w:type="gramEnd"/>
+      <w:r>
+        <w:t xml:space="preserve"> not require </w:t>
       </w:r>
       <w:r>
         <w:t xml:space="preserve">users to </w:t>
@@ -27055,7 +27189,15 @@
         <w:ind w:left="504"/>
       </w:pPr>
       <w:r>
-        <w:t>The system shall not allow the product manager to delete more than 20 products per day</w:t>
+        <w:t xml:space="preserve">The system </w:t>
+      </w:r>
+      <w:proofErr w:type="gramStart"/>
+      <w:r>
+        <w:t>shall</w:t>
+      </w:r>
+      <w:proofErr w:type="gramEnd"/>
+      <w:r>
+        <w:t xml:space="preserve"> not allow the product manager to delete more than 20 products per day</w:t>
       </w:r>
     </w:p>
     <w:p>
@@ -33205,19 +33347,6 @@
 </file>
 
 <file path=customXml/item1.xml><?xml version="1.0" encoding="utf-8"?>
-<b:Sources xmlns:b="http://schemas.openxmlformats.org/officeDocument/2006/bibliography" xmlns="http://schemas.openxmlformats.org/officeDocument/2006/bibliography" SelectedStyle="\APASixthEditionOfficeOnline.xsl" StyleName="APA" Version="6"/>
-</file>
-
-<file path=customXml/item2.xml><?xml version="1.0" encoding="utf-8"?>
-<?mso-contentType ?>
-<FormTemplates xmlns="http://schemas.microsoft.com/sharepoint/v3/contenttype/forms">
-  <Display>DocumentLibraryForm</Display>
-  <Edit>DocumentLibraryForm</Edit>
-  <New>DocumentLibraryForm</New>
-</FormTemplates>
-</file>
-
-<file path=customXml/item3.xml><?xml version="1.0" encoding="utf-8"?>
 <ct:contentTypeSchema xmlns:ct="http://schemas.microsoft.com/office/2006/metadata/contentType" xmlns:ma="http://schemas.microsoft.com/office/2006/metadata/properties/metaAttributes" ct:_="" ma:_="" ma:contentTypeName="Document" ma:contentTypeID="0x010100CEB410CF44B9F94DA0FE6BF7E65A0904" ma:contentTypeVersion="3" ma:contentTypeDescription="Create a new document." ma:contentTypeScope="" ma:versionID="d4a3d150d5290d1a71260648fa0a71db">
   <xsd:schema xmlns:xsd="http://www.w3.org/2001/XMLSchema" xmlns:xs="http://www.w3.org/2001/XMLSchema" xmlns:p="http://schemas.microsoft.com/office/2006/metadata/properties" xmlns:ns2="37aacdc0-cdcb-42f5-a85d-c756599e7b09" targetNamespace="http://schemas.microsoft.com/office/2006/metadata/properties" ma:root="true" ma:fieldsID="099df1950c9fa7586d90b31dc4c0d5bc" ns2:_="">
     <xsd:import namespace="37aacdc0-cdcb-42f5-a85d-c756599e7b09"/>
@@ -33355,6 +33484,19 @@
 </ct:contentTypeSchema>
 </file>
 
+<file path=customXml/item2.xml><?xml version="1.0" encoding="utf-8"?>
+<?mso-contentType ?>
+<FormTemplates xmlns="http://schemas.microsoft.com/sharepoint/v3/contenttype/forms">
+  <Display>DocumentLibraryForm</Display>
+  <Edit>DocumentLibraryForm</Edit>
+  <New>DocumentLibraryForm</New>
+</FormTemplates>
+</file>
+
+<file path=customXml/item3.xml><?xml version="1.0" encoding="utf-8"?>
+<b:Sources xmlns:b="http://schemas.openxmlformats.org/officeDocument/2006/bibliography" xmlns="http://schemas.openxmlformats.org/officeDocument/2006/bibliography" SelectedStyle="\APASixthEditionOfficeOnline.xsl" StyleName="APA" Version="6"/>
+</file>
+
 <file path=customXml/item4.xml><?xml version="1.0" encoding="utf-8"?>
 <p:properties xmlns:p="http://schemas.microsoft.com/office/2006/metadata/properties" xmlns:xsi="http://www.w3.org/2001/XMLSchema-instance" xmlns:pc="http://schemas.microsoft.com/office/infopath/2007/PartnerControls">
   <documentManagement/>
@@ -33362,22 +33504,6 @@
 </file>
 
 <file path=customXml/itemProps1.xml><?xml version="1.0" encoding="utf-8"?>
-<ds:datastoreItem xmlns:ds="http://schemas.openxmlformats.org/officeDocument/2006/customXml" ds:itemID="{7BBDEB9B-FEAA-4C39-9876-C44434EC0138}">
-  <ds:schemaRefs>
-    <ds:schemaRef ds:uri="http://schemas.openxmlformats.org/officeDocument/2006/bibliography"/>
-  </ds:schemaRefs>
-</ds:datastoreItem>
-</file>
-
-<file path=customXml/itemProps2.xml><?xml version="1.0" encoding="utf-8"?>
-<ds:datastoreItem xmlns:ds="http://schemas.openxmlformats.org/officeDocument/2006/customXml" ds:itemID="{2B84F465-9B47-4EE7-9BEB-A766E8F94242}">
-  <ds:schemaRefs>
-    <ds:schemaRef ds:uri="http://schemas.microsoft.com/sharepoint/v3/contenttype/forms"/>
-  </ds:schemaRefs>
-</ds:datastoreItem>
-</file>
-
-<file path=customXml/itemProps3.xml><?xml version="1.0" encoding="utf-8"?>
 <ds:datastoreItem xmlns:ds="http://schemas.openxmlformats.org/officeDocument/2006/customXml" ds:itemID="{42CCB020-1BC0-4E34-8C55-5450D29688ED}">
   <ds:schemaRefs>
     <ds:schemaRef ds:uri="http://schemas.microsoft.com/office/2006/metadata/contentType"/>
@@ -33395,6 +33521,22 @@
 </ds:datastoreItem>
 </file>
 
+<file path=customXml/itemProps2.xml><?xml version="1.0" encoding="utf-8"?>
+<ds:datastoreItem xmlns:ds="http://schemas.openxmlformats.org/officeDocument/2006/customXml" ds:itemID="{2B84F465-9B47-4EE7-9BEB-A766E8F94242}">
+  <ds:schemaRefs>
+    <ds:schemaRef ds:uri="http://schemas.microsoft.com/sharepoint/v3/contenttype/forms"/>
+  </ds:schemaRefs>
+</ds:datastoreItem>
+</file>
+
+<file path=customXml/itemProps3.xml><?xml version="1.0" encoding="utf-8"?>
+<ds:datastoreItem xmlns:ds="http://schemas.openxmlformats.org/officeDocument/2006/customXml" ds:itemID="{7BBDEB9B-FEAA-4C39-9876-C44434EC0138}">
+  <ds:schemaRefs>
+    <ds:schemaRef ds:uri="http://schemas.openxmlformats.org/officeDocument/2006/bibliography"/>
+  </ds:schemaRefs>
+</ds:datastoreItem>
+</file>
+
 <file path=customXml/itemProps4.xml><?xml version="1.0" encoding="utf-8"?>
 <ds:datastoreItem xmlns:ds="http://schemas.openxmlformats.org/officeDocument/2006/customXml" ds:itemID="{99C051D8-2C2B-411B-8E96-F777845A689B}">
   <ds:schemaRefs>

</xml_diff>